<commit_message>
Archive layered refactor and verified brake output
</commit_message>
<xml_diff>
--- a/doc/电机驱动板通信协议.docx
+++ b/doc/电机驱动板通信协议.docx
@@ -2,13 +2,7 @@
 <file path=word/document.xml><?xml version="1.0" encoding="utf-8"?>
 <w:document xmlns:wpc="http://schemas.microsoft.com/office/word/2010/wordprocessingCanvas" xmlns:cx="http://schemas.microsoft.com/office/drawing/2014/chartex" xmlns:cx1="http://schemas.microsoft.com/office/drawing/2015/9/8/chartex" xmlns:cx2="http://schemas.microsoft.com/office/drawing/2015/10/21/chartex" xmlns:cx3="http://schemas.microsoft.com/office/drawing/2016/5/9/chartex" xmlns:cx4="http://schemas.microsoft.com/office/drawing/2016/5/10/chartex" xmlns:cx5="http://schemas.microsoft.com/office/drawing/2016/5/11/chartex" xmlns:cx6="http://schemas.microsoft.com/office/drawing/2016/5/12/chartex" xmlns:cx7="http://schemas.microsoft.com/office/drawing/2016/5/13/chartex" xmlns:cx8="http://schemas.microsoft.com/office/drawing/2016/5/14/chartex" xmlns:mc="http://schemas.openxmlformats.org/markup-compatibility/2006" xmlns:aink="http://schemas.microsoft.com/office/drawing/2016/ink" xmlns:am3d="http://schemas.microsoft.com/office/drawing/2017/model3d" xmlns:o="urn:schemas-microsoft-com:office:office" xmlns:oel="http://schemas.microsoft.com/office/2019/extlst" xmlns:r="http://schemas.openxmlformats.org/officeDocument/2006/relationships" xmlns:m="http://schemas.openxmlformats.org/officeDocument/2006/math" xmlns:v="urn:schemas-microsoft-com:vml" xmlns:wp14="http://schemas.microsoft.com/office/word/2010/wordprocessingDrawing" xmlns:wp="http://schemas.openxmlformats.org/drawingml/2006/wordprocessingDrawing" xmlns:w10="urn:schemas-microsoft-com:office:word" xmlns:w="http://schemas.openxmlformats.org/wordprocessingml/2006/main" xmlns:w14="http://schemas.microsoft.com/office/word/2010/wordml" xmlns:w15="http://schemas.microsoft.com/office/word/2012/wordml" xmlns:w16cex="http://schemas.microsoft.com/office/word/2018/wordml/cex" xmlns:w16cid="http://schemas.microsoft.com/office/word/2016/wordml/cid" xmlns:w16="http://schemas.microsoft.com/office/word/2018/wordml" xmlns:w16du="http://schemas.microsoft.com/office/word/2023/wordml/word16du" xmlns:w16sdtdh="http://schemas.microsoft.com/office/word/2020/wordml/sdtdatahash" xmlns:w16sdtfl="http://schemas.microsoft.com/office/word/2024/wordml/sdtformatlock" xmlns:w16se="http://schemas.microsoft.com/office/word/2015/wordml/symex" xmlns:wpg="http://schemas.microsoft.com/office/word/2010/wordprocessingGroup" xmlns:wpi="http://schemas.microsoft.com/office/word/2010/wordprocessingInk" xmlns:wne="http://schemas.microsoft.com/office/word/2006/wordml" xmlns:wps="http://schemas.microsoft.com/office/word/2010/wordprocessingShape" mc:Ignorable="w14 w15 w16se w16cid w16 w16cex w16sdtdh w16sdtfl w16du wp14">
   <w:body>
-    <w:p>
-      <w:pPr>
-        <w:rPr>
-          <w:rFonts w:hint="eastAsia"/>
-        </w:rPr>
-      </w:pPr>
-    </w:p>
+    <w:p/>
     <w:p>
       <w:pPr>
         <w:jc w:val="center"/>
@@ -755,7 +749,7 @@
     <w:p>
       <w:pPr>
         <w:rPr>
-          <w:rFonts w:cs="Times New Roman" w:hint="eastAsia"/>
+          <w:rFonts w:cs="Times New Roman"/>
         </w:rPr>
       </w:pPr>
     </w:p>
@@ -780,7 +774,7 @@
             <w:pPr>
               <w:jc w:val="center"/>
               <w:rPr>
-                <w:rFonts w:cs="Times New Roman" w:hint="eastAsia"/>
+                <w:rFonts w:cs="Times New Roman"/>
               </w:rPr>
             </w:pPr>
             <w:r>
@@ -801,7 +795,7 @@
             <w:pPr>
               <w:jc w:val="center"/>
               <w:rPr>
-                <w:rFonts w:cs="Times New Roman" w:hint="eastAsia"/>
+                <w:rFonts w:cs="Times New Roman"/>
               </w:rPr>
             </w:pPr>
             <w:r>
@@ -822,7 +816,7 @@
             <w:pPr>
               <w:jc w:val="center"/>
               <w:rPr>
-                <w:rFonts w:cs="Times New Roman" w:hint="eastAsia"/>
+                <w:rFonts w:cs="Times New Roman"/>
               </w:rPr>
             </w:pPr>
             <w:r>
@@ -830,6 +824,163 @@
                 <w:rFonts w:cs="Times New Roman" w:hint="eastAsia"/>
               </w:rPr>
               <w:t>说明</w:t>
+            </w:r>
+          </w:p>
+        </w:tc>
+      </w:tr>
+      <w:tr>
+        <w:tc>
+          <w:tcPr>
+            <w:tcW w:w="937" w:type="pct"/>
+            <w:vAlign w:val="center"/>
+          </w:tcPr>
+          <w:p>
+            <w:pPr>
+              <w:jc w:val="center"/>
+              <w:rPr>
+                <w:rFonts w:cs="Times New Roman"/>
+                <w:color w:val="000000"/>
+              </w:rPr>
+            </w:pPr>
+            <w:r>
+              <w:rPr>
+                <w:rFonts w:cs="Times New Roman" w:hint="eastAsia"/>
+              </w:rPr>
+              <w:t>0x0100</w:t>
+            </w:r>
+          </w:p>
+        </w:tc>
+        <w:tc>
+          <w:tcPr>
+            <w:tcW w:w="1110" w:type="pct"/>
+            <w:vAlign w:val="center"/>
+          </w:tcPr>
+          <w:p>
+            <w:pPr>
+              <w:jc w:val="center"/>
+              <w:rPr>
+                <w:rFonts w:cs="Times New Roman"/>
+              </w:rPr>
+            </w:pPr>
+            <w:r>
+              <w:rPr>
+                <w:rFonts w:cs="Times New Roman" w:hint="eastAsia"/>
+              </w:rPr>
+              <w:t>0x</w:t>
+            </w:r>
+            <w:r>
+              <w:rPr>
+                <w:rFonts w:cs="Times New Roman" w:hint="eastAsia"/>
+                <w:color w:val="000000"/>
+              </w:rPr>
+              <w:t>00</w:t>
+            </w:r>
+            <w:r>
+              <w:rPr>
+                <w:rFonts w:cs="Times New Roman" w:hint="eastAsia"/>
+              </w:rPr>
+              <w:t xml:space="preserve"> 0x00</w:t>
+            </w:r>
+          </w:p>
+          <w:p>
+            <w:pPr>
+              <w:jc w:val="center"/>
+              <w:rPr>
+                <w:rFonts w:cs="Times New Roman"/>
+              </w:rPr>
+            </w:pPr>
+            <w:r>
+              <w:rPr>
+                <w:rFonts w:cs="Times New Roman" w:hint="eastAsia"/>
+              </w:rPr>
+              <w:t>0x</w:t>
+            </w:r>
+            <w:r>
+              <w:rPr>
+                <w:rFonts w:cs="Times New Roman" w:hint="eastAsia"/>
+                <w:color w:val="000000"/>
+              </w:rPr>
+              <w:t>00</w:t>
+            </w:r>
+            <w:r>
+              <w:rPr>
+                <w:rFonts w:cs="Times New Roman" w:hint="eastAsia"/>
+              </w:rPr>
+              <w:t xml:space="preserve"> 0x00</w:t>
+            </w:r>
+          </w:p>
+          <w:p>
+            <w:pPr>
+              <w:jc w:val="center"/>
+              <w:rPr>
+                <w:rFonts w:cs="Times New Roman"/>
+              </w:rPr>
+            </w:pPr>
+            <w:r>
+              <w:rPr>
+                <w:rFonts w:cs="Times New Roman" w:hint="eastAsia"/>
+              </w:rPr>
+              <w:t>0x</w:t>
+            </w:r>
+            <w:r>
+              <w:rPr>
+                <w:rFonts w:cs="Times New Roman" w:hint="eastAsia"/>
+                <w:color w:val="000000"/>
+              </w:rPr>
+              <w:t>00</w:t>
+            </w:r>
+            <w:r>
+              <w:rPr>
+                <w:rFonts w:cs="Times New Roman" w:hint="eastAsia"/>
+              </w:rPr>
+              <w:t xml:space="preserve"> 0x00</w:t>
+            </w:r>
+          </w:p>
+          <w:p>
+            <w:pPr>
+              <w:jc w:val="center"/>
+              <w:rPr>
+                <w:rFonts w:cs="Times New Roman"/>
+              </w:rPr>
+            </w:pPr>
+            <w:r>
+              <w:rPr>
+                <w:rFonts w:cs="Times New Roman" w:hint="eastAsia"/>
+              </w:rPr>
+              <w:t>0x</w:t>
+            </w:r>
+            <w:r>
+              <w:rPr>
+                <w:rFonts w:cs="Times New Roman" w:hint="eastAsia"/>
+                <w:color w:val="000000"/>
+              </w:rPr>
+              <w:t>00</w:t>
+            </w:r>
+            <w:r>
+              <w:rPr>
+                <w:rFonts w:cs="Times New Roman" w:hint="eastAsia"/>
+              </w:rPr>
+              <w:t xml:space="preserve"> 0x00</w:t>
+            </w:r>
+          </w:p>
+        </w:tc>
+        <w:tc>
+          <w:tcPr>
+            <w:tcW w:w="2953" w:type="pct"/>
+            <w:vAlign w:val="center"/>
+          </w:tcPr>
+          <w:p>
+            <w:pPr>
+              <w:jc w:val="center"/>
+              <w:rPr>
+                <w:rFonts w:cs="Times New Roman"/>
+              </w:rPr>
+            </w:pPr>
+            <w:r>
+              <w:rPr>
+                <w:rFonts w:cs="Times New Roman" w:hint="eastAsia"/>
+              </w:rPr>
+              <w:t>用来检测串口正常</w:t>
             </w:r>
           </w:p>
         </w:tc>
@@ -848,7 +999,68 @@
             <w:pPr>
               <w:jc w:val="center"/>
               <w:rPr>
-                <w:rFonts w:cs="Times New Roman" w:hint="eastAsia"/>
+                <w:rFonts w:cs="Times New Roman"/>
+              </w:rPr>
+            </w:pPr>
+            <w:r>
+              <w:rPr>
+                <w:rFonts w:cs="Times New Roman" w:hint="eastAsia"/>
+              </w:rPr>
+              <w:t>0x0</w:t>
+            </w:r>
+            <w:r>
+              <w:rPr>
+                <w:rFonts w:cs="Times New Roman" w:hint="eastAsia"/>
+              </w:rPr>
+              <w:t>2</w:t>
+            </w:r>
+            <w:r>
+              <w:rPr>
+                <w:rFonts w:cs="Times New Roman" w:hint="eastAsia"/>
+              </w:rPr>
+              <w:t>00</w:t>
+            </w:r>
+          </w:p>
+        </w:tc>
+        <w:tc>
+          <w:tcPr>
+            <w:tcW w:w="1110" w:type="pct"/>
+            <w:vAlign w:val="center"/>
+          </w:tcPr>
+          <w:p>
+            <w:pPr>
+              <w:jc w:val="center"/>
+              <w:rPr>
+                <w:rFonts w:cs="Times New Roman"/>
+              </w:rPr>
+            </w:pPr>
+            <w:bookmarkStart w:id="1" w:name="OLE_LINK2"/>
+            <w:r>
+              <w:rPr>
+                <w:rFonts w:cs="Times New Roman" w:hint="eastAsia"/>
+              </w:rPr>
+              <w:t>0x</w:t>
+            </w:r>
+            <w:r>
+              <w:rPr>
+                <w:rFonts w:cs="Times New Roman"/>
+                <w:color w:val="000000"/>
+              </w:rPr>
+              <w:t>XX</w:t>
+            </w:r>
+            <w:bookmarkEnd w:id="1"/>
+          </w:p>
+        </w:tc>
+        <w:tc>
+          <w:tcPr>
+            <w:tcW w:w="2953" w:type="pct"/>
+            <w:vAlign w:val="center"/>
+          </w:tcPr>
+          <w:p>
+            <w:pPr>
+              <w:jc w:val="center"/>
+              <w:rPr>
+                <w:rFonts w:cs="Times New Roman"/>
               </w:rPr>
             </w:pPr>
             <w:r>
@@ -861,73 +1073,6 @@
               <w:rPr>
                 <w:rFonts w:cs="Times New Roman" w:hint="eastAsia"/>
               </w:rPr>
-              <w:t>00</w:t>
-            </w:r>
-          </w:p>
-        </w:tc>
-        <w:tc>
-          <w:tcPr>
-            <w:tcW w:w="1110" w:type="pct"/>
-            <w:vAlign w:val="center"/>
-          </w:tcPr>
-          <w:p>
-            <w:pPr>
-              <w:jc w:val="center"/>
-              <w:rPr>
-                <w:rFonts w:cs="Times New Roman" w:hint="eastAsia"/>
-              </w:rPr>
-            </w:pPr>
-            <w:bookmarkStart w:id="1" w:name="OLE_LINK2"/>
-            <w:r>
-              <w:rPr>
-                <w:rFonts w:cs="Times New Roman" w:hint="eastAsia"/>
-              </w:rPr>
-              <w:t>0x</w:t>
-            </w:r>
-            <w:r>
-              <w:rPr>
-                <w:rFonts w:cs="Times New Roman"/>
-                <w:color w:val="000000"/>
-              </w:rPr>
-              <w:t>XX</w:t>
-            </w:r>
-            <w:r>
-              <w:rPr>
-                <w:rFonts w:cs="Times New Roman" w:hint="eastAsia"/>
-              </w:rPr>
-              <w:t xml:space="preserve"> 0x00</w:t>
-            </w:r>
-            <w:bookmarkEnd w:id="1"/>
-          </w:p>
-        </w:tc>
-        <w:tc>
-          <w:tcPr>
-            <w:tcW w:w="2953" w:type="pct"/>
-            <w:vAlign w:val="center"/>
-          </w:tcPr>
-          <w:p>
-            <w:pPr>
-              <w:jc w:val="center"/>
-              <w:rPr>
-                <w:rFonts w:cs="Times New Roman"/>
-              </w:rPr>
-            </w:pPr>
-            <w:r>
-              <w:rPr>
-                <w:rFonts w:cs="Times New Roman" w:hint="eastAsia"/>
-              </w:rPr>
-              <w:t>0x01 0x0</w:t>
-            </w:r>
-            <w:r>
-              <w:rPr>
-                <w:rFonts w:cs="Times New Roman" w:hint="eastAsia"/>
-              </w:rPr>
-              <w:t>0</w:t>
-            </w:r>
-            <w:r>
-              <w:rPr>
-                <w:rFonts w:cs="Times New Roman" w:hint="eastAsia"/>
-              </w:rPr>
               <w:t>：</w:t>
             </w:r>
             <w:r>
@@ -947,20 +1092,14 @@
             <w:pPr>
               <w:jc w:val="center"/>
               <w:rPr>
-                <w:rFonts w:cs="Times New Roman" w:hint="eastAsia"/>
-              </w:rPr>
-            </w:pPr>
-            <w:r>
-              <w:rPr>
-                <w:rFonts w:cs="Times New Roman" w:hint="eastAsia"/>
-              </w:rPr>
-              <w:t>0x02 0x0</w:t>
-            </w:r>
-            <w:r>
-              <w:rPr>
-                <w:rFonts w:cs="Times New Roman" w:hint="eastAsia"/>
-              </w:rPr>
-              <w:t>0</w:t>
+                <w:rFonts w:cs="Times New Roman"/>
+              </w:rPr>
+            </w:pPr>
+            <w:r>
+              <w:rPr>
+                <w:rFonts w:cs="Times New Roman" w:hint="eastAsia"/>
+              </w:rPr>
+              <w:t>0x02</w:t>
             </w:r>
             <w:r>
               <w:rPr>
@@ -985,20 +1124,14 @@
             <w:pPr>
               <w:jc w:val="center"/>
               <w:rPr>
-                <w:rFonts w:cs="Times New Roman" w:hint="eastAsia"/>
-              </w:rPr>
-            </w:pPr>
-            <w:r>
-              <w:rPr>
-                <w:rFonts w:cs="Times New Roman" w:hint="eastAsia"/>
-              </w:rPr>
-              <w:t>0x03 0x0</w:t>
-            </w:r>
-            <w:r>
-              <w:rPr>
-                <w:rFonts w:cs="Times New Roman" w:hint="eastAsia"/>
-              </w:rPr>
-              <w:t>0</w:t>
+                <w:rFonts w:cs="Times New Roman"/>
+              </w:rPr>
+            </w:pPr>
+            <w:r>
+              <w:rPr>
+                <w:rFonts w:cs="Times New Roman" w:hint="eastAsia"/>
+              </w:rPr>
+              <w:t>0x03</w:t>
             </w:r>
             <w:r>
               <w:rPr>
@@ -1035,7 +1168,7 @@
             <w:pPr>
               <w:jc w:val="center"/>
               <w:rPr>
-                <w:rFonts w:cs="Times New Roman" w:hint="eastAsia"/>
+                <w:rFonts w:cs="Times New Roman"/>
               </w:rPr>
             </w:pPr>
           </w:p>
@@ -1049,7 +1182,7 @@
             <w:pPr>
               <w:jc w:val="center"/>
               <w:rPr>
-                <w:rFonts w:cs="Times New Roman" w:hint="eastAsia"/>
+                <w:rFonts w:cs="Times New Roman"/>
               </w:rPr>
             </w:pPr>
             <w:r>
@@ -1065,12 +1198,6 @@
               </w:rPr>
               <w:t>XX</w:t>
             </w:r>
-            <w:r>
-              <w:rPr>
-                <w:rFonts w:cs="Times New Roman" w:hint="eastAsia"/>
-              </w:rPr>
-              <w:t xml:space="preserve"> 0x00</w:t>
-            </w:r>
           </w:p>
         </w:tc>
         <w:tc>
@@ -1089,57 +1216,45 @@
               <w:rPr>
                 <w:rFonts w:cs="Times New Roman" w:hint="eastAsia"/>
               </w:rPr>
-              <w:t>0x01 0x00</w:t>
-            </w:r>
-            <w:r>
-              <w:rPr>
-                <w:rFonts w:cs="Times New Roman" w:hint="eastAsia"/>
-              </w:rPr>
-              <w:t>：</w:t>
-            </w:r>
-            <w:r>
-              <w:rPr>
-                <w:rFonts w:cs="Times New Roman" w:hint="eastAsia"/>
-              </w:rPr>
-              <w:t>正向</w:t>
-            </w:r>
-            <w:r>
-              <w:rPr>
-                <w:rFonts w:cs="Times New Roman" w:hint="eastAsia"/>
-              </w:rPr>
-              <w:t>移动</w:t>
-            </w:r>
-          </w:p>
-          <w:p>
-            <w:pPr>
-              <w:jc w:val="center"/>
-              <w:rPr>
-                <w:rFonts w:cs="Times New Roman" w:hint="eastAsia"/>
-              </w:rPr>
-            </w:pPr>
-            <w:r>
-              <w:rPr>
-                <w:rFonts w:cs="Times New Roman" w:hint="eastAsia"/>
-              </w:rPr>
-              <w:t>0x02 0x00</w:t>
-            </w:r>
-            <w:r>
-              <w:rPr>
-                <w:rFonts w:cs="Times New Roman" w:hint="eastAsia"/>
-              </w:rPr>
-              <w:t>：</w:t>
-            </w:r>
-            <w:r>
-              <w:rPr>
-                <w:rFonts w:cs="Times New Roman" w:hint="eastAsia"/>
-              </w:rPr>
-              <w:t>负向</w:t>
-            </w:r>
-            <w:r>
-              <w:rPr>
-                <w:rFonts w:cs="Times New Roman" w:hint="eastAsia"/>
-              </w:rPr>
-              <w:t>移动</w:t>
+              <w:t>0x0</w:t>
+            </w:r>
+            <w:r>
+              <w:rPr>
+                <w:rFonts w:cs="Times New Roman" w:hint="eastAsia"/>
+              </w:rPr>
+              <w:t>0</w:t>
+            </w:r>
+            <w:r>
+              <w:rPr>
+                <w:rFonts w:cs="Times New Roman" w:hint="eastAsia"/>
+              </w:rPr>
+              <w:t>：正向移动</w:t>
+            </w:r>
+          </w:p>
+          <w:p>
+            <w:pPr>
+              <w:jc w:val="center"/>
+              <w:rPr>
+                <w:rFonts w:cs="Times New Roman"/>
+              </w:rPr>
+            </w:pPr>
+            <w:r>
+              <w:rPr>
+                <w:rFonts w:cs="Times New Roman" w:hint="eastAsia"/>
+              </w:rPr>
+              <w:t>0x0</w:t>
+            </w:r>
+            <w:r>
+              <w:rPr>
+                <w:rFonts w:cs="Times New Roman" w:hint="eastAsia"/>
+              </w:rPr>
+              <w:t>1</w:t>
+            </w:r>
+            <w:r>
+              <w:rPr>
+                <w:rFonts w:cs="Times New Roman" w:hint="eastAsia"/>
+              </w:rPr>
+              <w:t>：负向移动</w:t>
             </w:r>
           </w:p>
         </w:tc>
@@ -1158,7 +1273,7 @@
             <w:pPr>
               <w:jc w:val="center"/>
               <w:rPr>
-                <w:rFonts w:cs="Times New Roman" w:hint="eastAsia"/>
+                <w:rFonts w:cs="Times New Roman"/>
               </w:rPr>
             </w:pPr>
           </w:p>
@@ -1172,35 +1287,58 @@
             <w:pPr>
               <w:jc w:val="center"/>
               <w:rPr>
-                <w:rFonts w:cs="Times New Roman" w:hint="eastAsia"/>
-              </w:rPr>
-            </w:pPr>
-            <w:r>
-              <w:rPr>
-                <w:rFonts w:cs="Times New Roman" w:hint="eastAsia"/>
-              </w:rPr>
-              <w:t>0x00 0x00</w:t>
+                <w:rFonts w:cs="Times New Roman"/>
+              </w:rPr>
+            </w:pPr>
+            <w:r>
+              <w:rPr>
+                <w:rFonts w:cs="Times New Roman" w:hint="eastAsia"/>
+              </w:rPr>
+              <w:t>0x</w:t>
+            </w:r>
+            <w:r>
+              <w:rPr>
+                <w:rFonts w:cs="Times New Roman" w:hint="eastAsia"/>
+              </w:rPr>
+              <w:t>XX</w:t>
+            </w:r>
+            <w:r>
+              <w:rPr>
+                <w:rFonts w:cs="Times New Roman" w:hint="eastAsia"/>
+              </w:rPr>
+              <w:t xml:space="preserve"> 0x</w:t>
+            </w:r>
+            <w:r>
+              <w:rPr>
+                <w:rFonts w:cs="Times New Roman" w:hint="eastAsia"/>
+              </w:rPr>
+              <w:t>XX</w:t>
             </w:r>
           </w:p>
         </w:tc>
         <w:tc>
           <w:tcPr>
             <w:tcW w:w="2953" w:type="pct"/>
-            <w:vMerge w:val="restart"/>
-            <w:vAlign w:val="center"/>
-          </w:tcPr>
-          <w:p>
-            <w:pPr>
-              <w:jc w:val="center"/>
-              <w:rPr>
-                <w:rFonts w:cs="Times New Roman" w:hint="eastAsia"/>
-              </w:rPr>
-            </w:pPr>
-            <w:r>
-              <w:rPr>
-                <w:rFonts w:cs="Times New Roman" w:hint="eastAsia"/>
-              </w:rPr>
-              <w:t>移动距离</w:t>
+            <w:vAlign w:val="center"/>
+          </w:tcPr>
+          <w:p>
+            <w:pPr>
+              <w:jc w:val="center"/>
+              <w:rPr>
+                <w:rFonts w:cs="Times New Roman"/>
+              </w:rPr>
+            </w:pPr>
+            <w:r>
+              <w:rPr>
+                <w:rFonts w:cs="Times New Roman" w:hint="eastAsia"/>
+              </w:rPr>
+              <w:t>移动</w:t>
+            </w:r>
+            <w:r>
+              <w:rPr>
+                <w:rFonts w:cs="Times New Roman" w:hint="eastAsia"/>
+              </w:rPr>
+              <w:t>速度</w:t>
             </w:r>
           </w:p>
         </w:tc>
@@ -1219,7 +1357,7 @@
             <w:pPr>
               <w:jc w:val="center"/>
               <w:rPr>
-                <w:rFonts w:cs="Times New Roman" w:hint="eastAsia"/>
+                <w:rFonts w:cs="Times New Roman"/>
               </w:rPr>
             </w:pPr>
           </w:p>
@@ -1233,38 +1371,85 @@
             <w:pPr>
               <w:jc w:val="center"/>
               <w:rPr>
-                <w:rFonts w:cs="Times New Roman" w:hint="eastAsia"/>
-              </w:rPr>
-            </w:pPr>
-            <w:r>
-              <w:rPr>
-                <w:rFonts w:cs="Times New Roman" w:hint="eastAsia"/>
-              </w:rPr>
-              <w:t xml:space="preserve">0x00 </w:t>
-            </w:r>
-            <w:proofErr w:type="spellStart"/>
-            <w:r>
-              <w:rPr>
-                <w:rFonts w:cs="Times New Roman" w:hint="eastAsia"/>
-              </w:rPr>
-              <w:t>0x00</w:t>
-            </w:r>
-            <w:proofErr w:type="spellEnd"/>
+                <w:rFonts w:cs="Times New Roman"/>
+              </w:rPr>
+            </w:pPr>
+            <w:r>
+              <w:rPr>
+                <w:rFonts w:cs="Times New Roman" w:hint="eastAsia"/>
+              </w:rPr>
+              <w:t>0x</w:t>
+            </w:r>
+            <w:r>
+              <w:rPr>
+                <w:rFonts w:cs="Times New Roman" w:hint="eastAsia"/>
+              </w:rPr>
+              <w:t>XX</w:t>
+            </w:r>
+            <w:r>
+              <w:rPr>
+                <w:rFonts w:cs="Times New Roman" w:hint="eastAsia"/>
+              </w:rPr>
+              <w:t xml:space="preserve"> 0x</w:t>
+            </w:r>
+            <w:r>
+              <w:rPr>
+                <w:rFonts w:cs="Times New Roman" w:hint="eastAsia"/>
+              </w:rPr>
+              <w:t>XX</w:t>
+            </w:r>
+          </w:p>
+          <w:p>
+            <w:pPr>
+              <w:jc w:val="center"/>
+              <w:rPr>
+                <w:rFonts w:cs="Times New Roman"/>
+              </w:rPr>
+            </w:pPr>
+            <w:r>
+              <w:rPr>
+                <w:rFonts w:cs="Times New Roman" w:hint="eastAsia"/>
+              </w:rPr>
+              <w:t>0x</w:t>
+            </w:r>
+            <w:r>
+              <w:rPr>
+                <w:rFonts w:cs="Times New Roman" w:hint="eastAsia"/>
+              </w:rPr>
+              <w:t>XX</w:t>
+            </w:r>
+            <w:r>
+              <w:rPr>
+                <w:rFonts w:cs="Times New Roman" w:hint="eastAsia"/>
+              </w:rPr>
+              <w:t xml:space="preserve"> 0x</w:t>
+            </w:r>
+            <w:r>
+              <w:rPr>
+                <w:rFonts w:cs="Times New Roman" w:hint="eastAsia"/>
+              </w:rPr>
+              <w:t>XX</w:t>
+            </w:r>
           </w:p>
         </w:tc>
         <w:tc>
           <w:tcPr>
             <w:tcW w:w="2953" w:type="pct"/>
-            <w:vMerge/>
-            <w:vAlign w:val="center"/>
-          </w:tcPr>
-          <w:p>
-            <w:pPr>
-              <w:jc w:val="center"/>
-              <w:rPr>
-                <w:rFonts w:cs="Times New Roman" w:hint="eastAsia"/>
-              </w:rPr>
-            </w:pPr>
+            <w:vAlign w:val="center"/>
+          </w:tcPr>
+          <w:p>
+            <w:pPr>
+              <w:jc w:val="center"/>
+              <w:rPr>
+                <w:rFonts w:cs="Times New Roman"/>
+              </w:rPr>
+            </w:pPr>
+            <w:r>
+              <w:rPr>
+                <w:rFonts w:cs="Times New Roman" w:hint="eastAsia"/>
+              </w:rPr>
+              <w:t>移动距离</w:t>
+            </w:r>
           </w:p>
         </w:tc>
       </w:tr>
@@ -1282,20 +1467,21 @@
             <w:pPr>
               <w:jc w:val="center"/>
               <w:rPr>
-                <w:rFonts w:cs="Times New Roman" w:hint="eastAsia"/>
-              </w:rPr>
-            </w:pPr>
-            <w:r>
-              <w:rPr>
-                <w:rFonts w:cs="Times New Roman" w:hint="eastAsia"/>
-              </w:rPr>
+                <w:rFonts w:cs="Times New Roman"/>
+              </w:rPr>
+            </w:pPr>
+            <w:r>
+              <w:rPr>
+                <w:rFonts w:cs="Times New Roman" w:hint="eastAsia"/>
+              </w:rPr>
+              <w:lastRenderedPageBreak/>
               <w:t>0x0</w:t>
             </w:r>
             <w:r>
               <w:rPr>
                 <w:rFonts w:cs="Times New Roman" w:hint="eastAsia"/>
               </w:rPr>
-              <w:t>2</w:t>
+              <w:t>3</w:t>
             </w:r>
             <w:r>
               <w:rPr>
@@ -1314,7 +1500,7 @@
             <w:pPr>
               <w:jc w:val="center"/>
               <w:rPr>
-                <w:rFonts w:cs="Times New Roman" w:hint="eastAsia"/>
+                <w:rFonts w:cs="Times New Roman"/>
               </w:rPr>
             </w:pPr>
             <w:r>
@@ -1367,7 +1553,7 @@
             <w:pPr>
               <w:jc w:val="center"/>
               <w:rPr>
-                <w:rFonts w:cs="Times New Roman" w:hint="eastAsia"/>
+                <w:rFonts w:cs="Times New Roman"/>
               </w:rPr>
             </w:pPr>
             <w:r>
@@ -1399,7 +1585,7 @@
             <w:pPr>
               <w:jc w:val="center"/>
               <w:rPr>
-                <w:rFonts w:cs="Times New Roman" w:hint="eastAsia"/>
+                <w:rFonts w:cs="Times New Roman"/>
               </w:rPr>
             </w:pPr>
           </w:p>
@@ -1433,16 +1619,8 @@
               <w:rPr>
                 <w:rFonts w:cs="Times New Roman" w:hint="eastAsia"/>
               </w:rPr>
-              <w:t xml:space="preserve"> </w:t>
-            </w:r>
-            <w:proofErr w:type="spellStart"/>
-            <w:r>
-              <w:rPr>
-                <w:rFonts w:cs="Times New Roman" w:hint="eastAsia"/>
-              </w:rPr>
-              <w:t>0x00</w:t>
-            </w:r>
-            <w:proofErr w:type="spellEnd"/>
+              <w:t xml:space="preserve"> 0x00</w:t>
+            </w:r>
           </w:p>
           <w:p>
             <w:pPr>
@@ -1468,22 +1646,14 @@
               <w:rPr>
                 <w:rFonts w:cs="Times New Roman" w:hint="eastAsia"/>
               </w:rPr>
-              <w:t xml:space="preserve"> </w:t>
-            </w:r>
-            <w:proofErr w:type="spellStart"/>
-            <w:r>
-              <w:rPr>
-                <w:rFonts w:cs="Times New Roman" w:hint="eastAsia"/>
-              </w:rPr>
-              <w:t>0x00</w:t>
-            </w:r>
-            <w:proofErr w:type="spellEnd"/>
-          </w:p>
-          <w:p>
-            <w:pPr>
-              <w:jc w:val="center"/>
-              <w:rPr>
-                <w:rFonts w:cs="Times New Roman" w:hint="eastAsia"/>
+              <w:t xml:space="preserve"> 0x00</w:t>
+            </w:r>
+          </w:p>
+          <w:p>
+            <w:pPr>
+              <w:jc w:val="center"/>
+              <w:rPr>
+                <w:rFonts w:cs="Times New Roman"/>
               </w:rPr>
             </w:pPr>
             <w:r>
@@ -1503,16 +1673,8 @@
               <w:rPr>
                 <w:rFonts w:cs="Times New Roman" w:hint="eastAsia"/>
               </w:rPr>
-              <w:t xml:space="preserve"> </w:t>
-            </w:r>
-            <w:proofErr w:type="spellStart"/>
-            <w:r>
-              <w:rPr>
-                <w:rFonts w:cs="Times New Roman" w:hint="eastAsia"/>
-              </w:rPr>
-              <w:t>0x00</w:t>
-            </w:r>
-            <w:proofErr w:type="spellEnd"/>
+              <w:t xml:space="preserve"> 0x00</w:t>
+            </w:r>
           </w:p>
         </w:tc>
         <w:tc>
@@ -1524,7 +1686,7 @@
             <w:pPr>
               <w:jc w:val="center"/>
               <w:rPr>
-                <w:rFonts w:cs="Times New Roman" w:hint="eastAsia"/>
+                <w:rFonts w:cs="Times New Roman"/>
               </w:rPr>
             </w:pPr>
             <w:r>
@@ -1550,15 +1712,26 @@
             <w:pPr>
               <w:jc w:val="center"/>
               <w:rPr>
-                <w:rFonts w:cs="Times New Roman" w:hint="eastAsia"/>
-              </w:rPr>
-            </w:pPr>
-            <w:r>
-              <w:rPr>
-                <w:rFonts w:cs="Times New Roman" w:hint="eastAsia"/>
-              </w:rPr>
-              <w:lastRenderedPageBreak/>
-              <w:t>0x0300</w:t>
+                <w:rFonts w:cs="Times New Roman"/>
+              </w:rPr>
+            </w:pPr>
+            <w:r>
+              <w:rPr>
+                <w:rFonts w:cs="Times New Roman" w:hint="eastAsia"/>
+              </w:rPr>
+              <w:t>0x0</w:t>
+            </w:r>
+            <w:r>
+              <w:rPr>
+                <w:rFonts w:cs="Times New Roman" w:hint="eastAsia"/>
+              </w:rPr>
+              <w:t>4</w:t>
+            </w:r>
+            <w:r>
+              <w:rPr>
+                <w:rFonts w:cs="Times New Roman" w:hint="eastAsia"/>
+              </w:rPr>
+              <w:t>00</w:t>
             </w:r>
           </w:p>
         </w:tc>
@@ -1571,7 +1744,7 @@
             <w:pPr>
               <w:jc w:val="center"/>
               <w:rPr>
-                <w:rFonts w:cs="Times New Roman" w:hint="eastAsia"/>
+                <w:rFonts w:cs="Times New Roman"/>
               </w:rPr>
             </w:pPr>
             <w:r>
@@ -1624,7 +1797,7 @@
             <w:pPr>
               <w:jc w:val="center"/>
               <w:rPr>
-                <w:rFonts w:cs="Times New Roman" w:hint="eastAsia"/>
+                <w:rFonts w:cs="Times New Roman"/>
               </w:rPr>
             </w:pPr>
             <w:r>
@@ -1656,7 +1829,7 @@
             <w:pPr>
               <w:jc w:val="center"/>
               <w:rPr>
-                <w:rFonts w:cs="Times New Roman" w:hint="eastAsia"/>
+                <w:rFonts w:cs="Times New Roman"/>
               </w:rPr>
             </w:pPr>
           </w:p>
@@ -1690,16 +1863,8 @@
               <w:rPr>
                 <w:rFonts w:cs="Times New Roman" w:hint="eastAsia"/>
               </w:rPr>
-              <w:t xml:space="preserve"> </w:t>
-            </w:r>
-            <w:proofErr w:type="spellStart"/>
-            <w:r>
-              <w:rPr>
-                <w:rFonts w:cs="Times New Roman" w:hint="eastAsia"/>
-              </w:rPr>
-              <w:t>0x00</w:t>
-            </w:r>
-            <w:proofErr w:type="spellEnd"/>
+              <w:t xml:space="preserve"> 0x00</w:t>
+            </w:r>
           </w:p>
           <w:p>
             <w:pPr>
@@ -1725,22 +1890,14 @@
               <w:rPr>
                 <w:rFonts w:cs="Times New Roman" w:hint="eastAsia"/>
               </w:rPr>
-              <w:t xml:space="preserve"> </w:t>
-            </w:r>
-            <w:proofErr w:type="spellStart"/>
-            <w:r>
-              <w:rPr>
-                <w:rFonts w:cs="Times New Roman" w:hint="eastAsia"/>
-              </w:rPr>
-              <w:t>0x00</w:t>
-            </w:r>
-            <w:proofErr w:type="spellEnd"/>
-          </w:p>
-          <w:p>
-            <w:pPr>
-              <w:jc w:val="center"/>
-              <w:rPr>
-                <w:rFonts w:cs="Times New Roman" w:hint="eastAsia"/>
+              <w:t xml:space="preserve"> 0x00</w:t>
+            </w:r>
+          </w:p>
+          <w:p>
+            <w:pPr>
+              <w:jc w:val="center"/>
+              <w:rPr>
+                <w:rFonts w:cs="Times New Roman"/>
               </w:rPr>
             </w:pPr>
             <w:r>
@@ -1760,16 +1917,8 @@
               <w:rPr>
                 <w:rFonts w:cs="Times New Roman" w:hint="eastAsia"/>
               </w:rPr>
-              <w:t xml:space="preserve"> </w:t>
-            </w:r>
-            <w:proofErr w:type="spellStart"/>
-            <w:r>
-              <w:rPr>
-                <w:rFonts w:cs="Times New Roman" w:hint="eastAsia"/>
-              </w:rPr>
-              <w:t>0x00</w:t>
-            </w:r>
-            <w:proofErr w:type="spellEnd"/>
+              <w:t xml:space="preserve"> 0x00</w:t>
+            </w:r>
           </w:p>
         </w:tc>
         <w:tc>
@@ -1781,20 +1930,14 @@
             <w:pPr>
               <w:jc w:val="center"/>
               <w:rPr>
-                <w:rFonts w:cs="Times New Roman" w:hint="eastAsia"/>
-              </w:rPr>
-            </w:pPr>
-            <w:r>
-              <w:rPr>
-                <w:rFonts w:cs="Times New Roman" w:hint="eastAsia"/>
-              </w:rPr>
-              <w:t>抱闸</w:t>
-            </w:r>
-            <w:r>
-              <w:rPr>
-                <w:rFonts w:cs="Times New Roman" w:hint="eastAsia"/>
-              </w:rPr>
-              <w:t>控制</w:t>
+                <w:rFonts w:cs="Times New Roman"/>
+              </w:rPr>
+            </w:pPr>
+            <w:r>
+              <w:rPr>
+                <w:rFonts w:cs="Times New Roman" w:hint="eastAsia"/>
+              </w:rPr>
+              <w:t>抱闸控制</w:t>
             </w:r>
           </w:p>
         </w:tc>
@@ -1813,7 +1956,7 @@
             <w:pPr>
               <w:jc w:val="center"/>
               <w:rPr>
-                <w:rFonts w:cs="Times New Roman" w:hint="eastAsia"/>
+                <w:rFonts w:cs="Times New Roman"/>
               </w:rPr>
             </w:pPr>
             <w:r>
@@ -1826,7 +1969,7 @@
               <w:rPr>
                 <w:rFonts w:cs="Times New Roman" w:hint="eastAsia"/>
               </w:rPr>
-              <w:t>4</w:t>
+              <w:t>5</w:t>
             </w:r>
             <w:r>
               <w:rPr>
@@ -1845,7 +1988,7 @@
             <w:pPr>
               <w:jc w:val="center"/>
               <w:rPr>
-                <w:rFonts w:cs="Times New Roman" w:hint="eastAsia"/>
+                <w:rFonts w:cs="Times New Roman"/>
               </w:rPr>
             </w:pPr>
             <w:r>
@@ -1898,7 +2041,7 @@
             <w:pPr>
               <w:jc w:val="center"/>
               <w:rPr>
-                <w:rFonts w:cs="Times New Roman" w:hint="eastAsia"/>
+                <w:rFonts w:cs="Times New Roman"/>
               </w:rPr>
             </w:pPr>
             <w:r>
@@ -1930,7 +2073,7 @@
             <w:pPr>
               <w:jc w:val="center"/>
               <w:rPr>
-                <w:rFonts w:cs="Times New Roman" w:hint="eastAsia"/>
+                <w:rFonts w:cs="Times New Roman"/>
               </w:rPr>
             </w:pPr>
           </w:p>
@@ -1944,7 +2087,7 @@
             <w:pPr>
               <w:jc w:val="center"/>
               <w:rPr>
-                <w:rFonts w:cs="Times New Roman" w:hint="eastAsia"/>
+                <w:rFonts w:cs="Times New Roman"/>
               </w:rPr>
             </w:pPr>
             <w:r>
@@ -1964,16 +2107,8 @@
               <w:rPr>
                 <w:rFonts w:cs="Times New Roman" w:hint="eastAsia"/>
               </w:rPr>
-              <w:t xml:space="preserve"> </w:t>
-            </w:r>
-            <w:proofErr w:type="spellStart"/>
-            <w:r>
-              <w:rPr>
-                <w:rFonts w:cs="Times New Roman" w:hint="eastAsia"/>
-              </w:rPr>
-              <w:t>0x00</w:t>
-            </w:r>
-            <w:proofErr w:type="spellEnd"/>
+              <w:t xml:space="preserve"> 0x00</w:t>
+            </w:r>
           </w:p>
         </w:tc>
         <w:tc>
@@ -2056,7 +2191,13 @@
               <w:rPr>
                 <w:rFonts w:cs="Times New Roman" w:hint="eastAsia"/>
               </w:rPr>
-              <w:t>0x0</w:t>
+              <w:t>0x03 0x00</w:t>
+            </w:r>
+            <w:r>
+              <w:rPr>
+                <w:rFonts w:cs="Times New Roman" w:hint="eastAsia"/>
+              </w:rPr>
+              <w:t>：</w:t>
             </w:r>
             <w:r>
               <w:rPr>
@@ -2068,24 +2209,6 @@
               <w:rPr>
                 <w:rFonts w:cs="Times New Roman" w:hint="eastAsia"/>
               </w:rPr>
-              <w:t xml:space="preserve"> 0x00</w:t>
-            </w:r>
-            <w:r>
-              <w:rPr>
-                <w:rFonts w:cs="Times New Roman" w:hint="eastAsia"/>
-              </w:rPr>
-              <w:t>：</w:t>
-            </w:r>
-            <w:r>
-              <w:rPr>
-                <w:rFonts w:cs="Times New Roman" w:hint="eastAsia"/>
-              </w:rPr>
-              <w:t>3</w:t>
-            </w:r>
-            <w:r>
-              <w:rPr>
-                <w:rFonts w:cs="Times New Roman" w:hint="eastAsia"/>
-              </w:rPr>
               <w:t>路</w:t>
             </w:r>
           </w:p>
@@ -2093,26 +2216,14 @@
             <w:pPr>
               <w:jc w:val="center"/>
               <w:rPr>
-                <w:rFonts w:cs="Times New Roman" w:hint="eastAsia"/>
-              </w:rPr>
-            </w:pPr>
-            <w:r>
-              <w:rPr>
-                <w:rFonts w:cs="Times New Roman" w:hint="eastAsia"/>
-              </w:rPr>
-              <w:t>0x0</w:t>
-            </w:r>
-            <w:r>
-              <w:rPr>
-                <w:rFonts w:cs="Times New Roman" w:hint="eastAsia"/>
-              </w:rPr>
-              <w:t>4</w:t>
-            </w:r>
-            <w:r>
-              <w:rPr>
-                <w:rFonts w:cs="Times New Roman" w:hint="eastAsia"/>
-              </w:rPr>
-              <w:t xml:space="preserve"> 0x00</w:t>
+                <w:rFonts w:cs="Times New Roman"/>
+              </w:rPr>
+            </w:pPr>
+            <w:r>
+              <w:rPr>
+                <w:rFonts w:cs="Times New Roman" w:hint="eastAsia"/>
+              </w:rPr>
+              <w:t>0x04 0x00</w:t>
             </w:r>
             <w:r>
               <w:rPr>
@@ -2149,7 +2260,7 @@
             <w:pPr>
               <w:jc w:val="center"/>
               <w:rPr>
-                <w:rFonts w:cs="Times New Roman" w:hint="eastAsia"/>
+                <w:rFonts w:cs="Times New Roman"/>
               </w:rPr>
             </w:pPr>
           </w:p>
@@ -2183,22 +2294,14 @@
               <w:rPr>
                 <w:rFonts w:cs="Times New Roman" w:hint="eastAsia"/>
               </w:rPr>
-              <w:t xml:space="preserve"> </w:t>
-            </w:r>
-            <w:proofErr w:type="spellStart"/>
-            <w:r>
-              <w:rPr>
-                <w:rFonts w:cs="Times New Roman" w:hint="eastAsia"/>
-              </w:rPr>
-              <w:t>0x00</w:t>
-            </w:r>
-            <w:proofErr w:type="spellEnd"/>
-          </w:p>
-          <w:p>
-            <w:pPr>
-              <w:jc w:val="center"/>
-              <w:rPr>
-                <w:rFonts w:cs="Times New Roman" w:hint="eastAsia"/>
+              <w:t xml:space="preserve"> 0x00</w:t>
+            </w:r>
+          </w:p>
+          <w:p>
+            <w:pPr>
+              <w:jc w:val="center"/>
+              <w:rPr>
+                <w:rFonts w:cs="Times New Roman"/>
               </w:rPr>
             </w:pPr>
             <w:r>
@@ -2218,16 +2321,8 @@
               <w:rPr>
                 <w:rFonts w:cs="Times New Roman" w:hint="eastAsia"/>
               </w:rPr>
-              <w:t xml:space="preserve"> </w:t>
-            </w:r>
-            <w:proofErr w:type="spellStart"/>
-            <w:r>
-              <w:rPr>
-                <w:rFonts w:cs="Times New Roman" w:hint="eastAsia"/>
-              </w:rPr>
-              <w:t>0x00</w:t>
-            </w:r>
-            <w:proofErr w:type="spellEnd"/>
+              <w:t xml:space="preserve"> 0x00</w:t>
+            </w:r>
           </w:p>
         </w:tc>
         <w:tc>
@@ -2239,7 +2334,7 @@
             <w:pPr>
               <w:jc w:val="center"/>
               <w:rPr>
-                <w:rFonts w:cs="Times New Roman" w:hint="eastAsia"/>
+                <w:rFonts w:cs="Times New Roman"/>
               </w:rPr>
             </w:pPr>
             <w:r>
@@ -2264,7 +2359,7 @@
             <w:pPr>
               <w:jc w:val="center"/>
               <w:rPr>
-                <w:rFonts w:cs="Times New Roman" w:hint="eastAsia"/>
+                <w:rFonts w:cs="Times New Roman"/>
               </w:rPr>
             </w:pPr>
           </w:p>
@@ -2278,7 +2373,7 @@
             <w:pPr>
               <w:jc w:val="center"/>
               <w:rPr>
-                <w:rFonts w:cs="Times New Roman" w:hint="eastAsia"/>
+                <w:rFonts w:cs="Times New Roman"/>
               </w:rPr>
             </w:pPr>
           </w:p>
@@ -2292,7 +2387,7 @@
             <w:pPr>
               <w:jc w:val="center"/>
               <w:rPr>
-                <w:rFonts w:cs="Times New Roman" w:hint="eastAsia"/>
+                <w:rFonts w:cs="Times New Roman"/>
               </w:rPr>
             </w:pPr>
           </w:p>
@@ -2302,7 +2397,7 @@
     <w:p>
       <w:pPr>
         <w:rPr>
-          <w:rFonts w:cs="Times New Roman" w:hint="eastAsia"/>
+          <w:rFonts w:cs="Times New Roman"/>
         </w:rPr>
       </w:pPr>
     </w:p>
@@ -2814,7 +2909,7 @@
   <w:style w:type="paragraph" w:default="1" w:styleId="a">
     <w:name w:val="Normal"/>
     <w:qFormat/>
-    <w:rsid w:val="007B6096"/>
+    <w:rsid w:val="00615367"/>
     <w:pPr>
       <w:widowControl w:val="0"/>
       <w:spacing w:line="360" w:lineRule="auto"/>

</xml_diff>

<commit_message>
Archive three-axis protocol development snapshot
</commit_message>
<xml_diff>
--- a/doc/电机驱动板通信协议.docx
+++ b/doc/电机驱动板通信协议.docx
@@ -59,19 +59,8 @@
             <w:shd w:fill="EAF3F8" w:val="clear"/>
           </w:tcPr>
           <w:p>
-            <w:pPr>
-              <w:keepNext w:val="0"/>
-              <w:spacing w:before="0" w:after="0" w:line="240" w:lineRule="auto"/>
-              <w:jc w:val="left"/>
-            </w:pPr>
-            <w:r/>
-            <w:r>
-              <w:rPr>
-                <w:rFonts w:ascii="Microsoft YaHei" w:hAnsi="Microsoft YaHei" w:eastAsia="Microsoft YaHei"/>
-                <w:b w:val="0"/>
-                <w:sz w:val="18"/>
-              </w:rPr>
-              <w:t>修订记录：2026-09-01。已补全当前固件的运动、停止、状态、限位、继电器、抱闸和灯板命令。用户已实测：X轴连续运行时，遮挡X轴限位可立即停止运动并回传限位错误0x0B。</w:t>
+            <w:r>
+              <w:t>修订记录：2026-09-03。已补全当前固件的 X/Y/Z 三轴独立运动、停止、状态、限位、继电器、抱闸和灯板命令。每次仅运行一个轴，不做多轴同步插补。用户已实测：X 轴连续运行时，遮挡 X 轴限位可立即停止运动并回传限位错误 0x0B。Y/Z 尚未完成实机验收。</w:t>
             </w:r>
           </w:p>
         </w:tc>
@@ -105,7 +94,7 @@
           <w:b w:val="0"/>
           <w:sz w:val="21"/>
         </w:rPr>
-        <w:t>本协议适用于STM32F103RC电机驱动板的CN4/USART3主机接口。当前运动协议只实现X轴；Y轴、Z轴的运动命令尚未开放。</w:t>
+        <w:t>本协议适用于STM32F103RC电机驱动板的CN4/USART3主机接口。当前运动协议支持X/Y/Z三轴独立运行；每次仅允许一个轴运动，不做多轴同步插补，另一轴在当前运动完成前不能启动。</w:t>
       </w:r>
     </w:p>
     <w:p>
@@ -1786,29 +1775,9 @@
             <w:shd w:fill="F2F5F7" w:val="clear"/>
           </w:tcPr>
           <w:p>
-            <w:pPr>
-              <w:keepNext w:val="0"/>
-              <w:spacing w:before="0" w:after="0" w:line="240" w:lineRule="auto"/>
-              <w:jc w:val="left"/>
-            </w:pPr>
-            <w:r/>
-            <w:r>
-              <w:rPr>
-                <w:rFonts w:ascii="Microsoft YaHei" w:hAnsi="Microsoft YaHei" w:eastAsia="Microsoft YaHei"/>
-                <w:b w:val="0"/>
-                <w:sz w:val="18"/>
-              </w:rPr>
+            <w:r>
               <w:t>02 00</w:t>
-            </w:r>
-            <w:r>
               <w:br/>
-            </w:r>
-            <w:r>
-              <w:rPr>
-                <w:rFonts w:ascii="Microsoft YaHei" w:hAnsi="Microsoft YaHei" w:eastAsia="Microsoft YaHei"/>
-                <w:b w:val="0"/>
-                <w:sz w:val="18"/>
-              </w:rPr>
               <w:t>定长运动</w:t>
             </w:r>
           </w:p>
@@ -1826,30 +1795,10 @@
             <w:shd w:fill="F2F5F7" w:val="clear"/>
           </w:tcPr>
           <w:p>
-            <w:pPr>
-              <w:keepNext w:val="0"/>
-              <w:spacing w:before="0" w:after="0" w:line="240" w:lineRule="auto"/>
-              <w:jc w:val="left"/>
-            </w:pPr>
-            <w:r/>
-            <w:r>
-              <w:rPr>
-                <w:rFonts w:ascii="Microsoft YaHei" w:hAnsi="Microsoft YaHei" w:eastAsia="Microsoft YaHei"/>
-                <w:b w:val="0"/>
-                <w:sz w:val="18"/>
-              </w:rPr>
-              <w:t>01</w:t>
-            </w:r>
-            <w:r>
+            <w:r>
+              <w:t>01/02/03</w:t>
               <w:br/>
-            </w:r>
-            <w:r>
-              <w:rPr>
-                <w:rFonts w:ascii="Microsoft YaHei" w:hAnsi="Microsoft YaHei" w:eastAsia="Microsoft YaHei"/>
-                <w:b w:val="0"/>
-                <w:sz w:val="18"/>
-              </w:rPr>
-              <w:t>X轴</w:t>
+              <w:t>X/Y/Z轴</w:t>
             </w:r>
           </w:p>
         </w:tc>
@@ -1866,29 +1815,9 @@
             <w:shd w:fill="F2F5F7" w:val="clear"/>
           </w:tcPr>
           <w:p>
-            <w:pPr>
-              <w:keepNext w:val="0"/>
-              <w:spacing w:before="0" w:after="0" w:line="240" w:lineRule="auto"/>
-              <w:jc w:val="left"/>
-            </w:pPr>
-            <w:r/>
-            <w:r>
-              <w:rPr>
-                <w:rFonts w:ascii="Microsoft YaHei" w:hAnsi="Microsoft YaHei" w:eastAsia="Microsoft YaHei"/>
-                <w:b w:val="0"/>
-                <w:sz w:val="18"/>
-              </w:rPr>
+            <w:r>
               <w:t>00/01</w:t>
-            </w:r>
-            <w:r>
               <w:br/>
-            </w:r>
-            <w:r>
-              <w:rPr>
-                <w:rFonts w:ascii="Microsoft YaHei" w:hAnsi="Microsoft YaHei" w:eastAsia="Microsoft YaHei"/>
-                <w:b w:val="0"/>
-                <w:sz w:val="18"/>
-              </w:rPr>
               <w:t>方向</w:t>
             </w:r>
           </w:p>
@@ -1906,18 +1835,7 @@
             <w:shd w:fill="F2F5F7" w:val="clear"/>
           </w:tcPr>
           <w:p>
-            <w:pPr>
-              <w:keepNext w:val="0"/>
-              <w:spacing w:before="0" w:after="0" w:line="240" w:lineRule="auto"/>
-              <w:jc w:val="left"/>
-            </w:pPr>
-            <w:r/>
-            <w:r>
-              <w:rPr>
-                <w:rFonts w:ascii="Microsoft YaHei" w:hAnsi="Microsoft YaHei" w:eastAsia="Microsoft YaHei"/>
-                <w:b w:val="0"/>
-                <w:sz w:val="18"/>
-              </w:rPr>
+            <w:r>
               <w:t>速度</w:t>
             </w:r>
           </w:p>
@@ -1935,18 +1853,7 @@
             <w:shd w:fill="F2F5F7" w:val="clear"/>
           </w:tcPr>
           <w:p>
-            <w:pPr>
-              <w:keepNext w:val="0"/>
-              <w:spacing w:before="0" w:after="0" w:line="240" w:lineRule="auto"/>
-              <w:jc w:val="left"/>
-            </w:pPr>
-            <w:r/>
-            <w:r>
-              <w:rPr>
-                <w:rFonts w:ascii="Microsoft YaHei" w:hAnsi="Microsoft YaHei" w:eastAsia="Microsoft YaHei"/>
-                <w:b w:val="0"/>
-                <w:sz w:val="18"/>
-              </w:rPr>
+            <w:r>
               <w:t>距离</w:t>
             </w:r>
           </w:p>
@@ -1964,19 +1871,8 @@
             <w:shd w:fill="F2F5F7" w:val="clear"/>
           </w:tcPr>
           <w:p>
-            <w:pPr>
-              <w:keepNext w:val="0"/>
-              <w:spacing w:before="0" w:after="0" w:line="240" w:lineRule="auto"/>
-              <w:jc w:val="left"/>
-            </w:pPr>
-            <w:r/>
-            <w:r>
-              <w:rPr>
-                <w:rFonts w:ascii="Microsoft YaHei" w:hAnsi="Microsoft YaHei" w:eastAsia="Microsoft YaHei"/>
-                <w:b w:val="0"/>
-                <w:sz w:val="18"/>
-              </w:rPr>
-              <w:t>X轴按指定速度和距离运行，带加减速。</w:t>
+            <w:r>
+              <w:t>指定轴按请求速度和距离运行，带加减速。</w:t>
             </w:r>
           </w:p>
         </w:tc>
@@ -1994,29 +1890,9 @@
             </w:tcMar>
           </w:tcPr>
           <w:p>
-            <w:pPr>
-              <w:keepNext w:val="0"/>
-              <w:spacing w:before="0" w:after="0" w:line="240" w:lineRule="auto"/>
-              <w:jc w:val="left"/>
-            </w:pPr>
-            <w:r/>
-            <w:r>
-              <w:rPr>
-                <w:rFonts w:ascii="Microsoft YaHei" w:hAnsi="Microsoft YaHei" w:eastAsia="Microsoft YaHei"/>
-                <w:b w:val="0"/>
-                <w:sz w:val="18"/>
-              </w:rPr>
+            <w:r>
               <w:t>02 F0</w:t>
-            </w:r>
-            <w:r>
               <w:br/>
-            </w:r>
-            <w:r>
-              <w:rPr>
-                <w:rFonts w:ascii="Microsoft YaHei" w:hAnsi="Microsoft YaHei" w:eastAsia="Microsoft YaHei"/>
-                <w:b w:val="0"/>
-                <w:sz w:val="18"/>
-              </w:rPr>
               <w:t>连续运动</w:t>
             </w:r>
           </w:p>
@@ -2033,30 +1909,10 @@
             </w:tcMar>
           </w:tcPr>
           <w:p>
-            <w:pPr>
-              <w:keepNext w:val="0"/>
-              <w:spacing w:before="0" w:after="0" w:line="240" w:lineRule="auto"/>
-              <w:jc w:val="left"/>
-            </w:pPr>
-            <w:r/>
-            <w:r>
-              <w:rPr>
-                <w:rFonts w:ascii="Microsoft YaHei" w:hAnsi="Microsoft YaHei" w:eastAsia="Microsoft YaHei"/>
-                <w:b w:val="0"/>
-                <w:sz w:val="18"/>
-              </w:rPr>
-              <w:t>01</w:t>
-            </w:r>
-            <w:r>
+            <w:r>
+              <w:t>01/02/03</w:t>
               <w:br/>
-            </w:r>
-            <w:r>
-              <w:rPr>
-                <w:rFonts w:ascii="Microsoft YaHei" w:hAnsi="Microsoft YaHei" w:eastAsia="Microsoft YaHei"/>
-                <w:b w:val="0"/>
-                <w:sz w:val="18"/>
-              </w:rPr>
-              <w:t>X轴</w:t>
+              <w:t>X/Y/Z轴</w:t>
             </w:r>
           </w:p>
         </w:tc>
@@ -2072,29 +1928,9 @@
             </w:tcMar>
           </w:tcPr>
           <w:p>
-            <w:pPr>
-              <w:keepNext w:val="0"/>
-              <w:spacing w:before="0" w:after="0" w:line="240" w:lineRule="auto"/>
-              <w:jc w:val="left"/>
-            </w:pPr>
-            <w:r/>
-            <w:r>
-              <w:rPr>
-                <w:rFonts w:ascii="Microsoft YaHei" w:hAnsi="Microsoft YaHei" w:eastAsia="Microsoft YaHei"/>
-                <w:b w:val="0"/>
-                <w:sz w:val="18"/>
-              </w:rPr>
+            <w:r>
               <w:t>00/01</w:t>
-            </w:r>
-            <w:r>
               <w:br/>
-            </w:r>
-            <w:r>
-              <w:rPr>
-                <w:rFonts w:ascii="Microsoft YaHei" w:hAnsi="Microsoft YaHei" w:eastAsia="Microsoft YaHei"/>
-                <w:b w:val="0"/>
-                <w:sz w:val="18"/>
-              </w:rPr>
               <w:t>方向</w:t>
             </w:r>
           </w:p>
@@ -2111,18 +1947,7 @@
             </w:tcMar>
           </w:tcPr>
           <w:p>
-            <w:pPr>
-              <w:keepNext w:val="0"/>
-              <w:spacing w:before="0" w:after="0" w:line="240" w:lineRule="auto"/>
-              <w:jc w:val="left"/>
-            </w:pPr>
-            <w:r/>
-            <w:r>
-              <w:rPr>
-                <w:rFonts w:ascii="Microsoft YaHei" w:hAnsi="Microsoft YaHei" w:eastAsia="Microsoft YaHei"/>
-                <w:b w:val="0"/>
-                <w:sz w:val="18"/>
-              </w:rPr>
+            <w:r>
               <w:t>速度</w:t>
             </w:r>
           </w:p>
@@ -2139,18 +1964,7 @@
             </w:tcMar>
           </w:tcPr>
           <w:p>
-            <w:pPr>
-              <w:keepNext w:val="0"/>
-              <w:spacing w:before="0" w:after="0" w:line="240" w:lineRule="auto"/>
-              <w:jc w:val="left"/>
-            </w:pPr>
-            <w:r/>
-            <w:r>
-              <w:rPr>
-                <w:rFonts w:ascii="Microsoft YaHei" w:hAnsi="Microsoft YaHei" w:eastAsia="Microsoft YaHei"/>
-                <w:b w:val="0"/>
-                <w:sz w:val="18"/>
-              </w:rPr>
+            <w:r>
               <w:t>00 00 00 00</w:t>
             </w:r>
           </w:p>
@@ -2167,19 +1981,8 @@
             </w:tcMar>
           </w:tcPr>
           <w:p>
-            <w:pPr>
-              <w:keepNext w:val="0"/>
-              <w:spacing w:before="0" w:after="0" w:line="240" w:lineRule="auto"/>
-              <w:jc w:val="left"/>
-            </w:pPr>
-            <w:r/>
-            <w:r>
-              <w:rPr>
-                <w:rFonts w:ascii="Microsoft YaHei" w:hAnsi="Microsoft YaHei" w:eastAsia="Microsoft YaHei"/>
-                <w:b w:val="0"/>
-                <w:sz w:val="18"/>
-              </w:rPr>
-              <w:t>X轴持续运行，直到停止、限位或故障。</w:t>
+            <w:r>
+              <w:t>指定轴持续运行，直到停止、限位或故障。</w:t>
             </w:r>
           </w:p>
         </w:tc>
@@ -2198,29 +2001,9 @@
             <w:shd w:fill="F2F5F7" w:val="clear"/>
           </w:tcPr>
           <w:p>
-            <w:pPr>
-              <w:keepNext w:val="0"/>
-              <w:spacing w:before="0" w:after="0" w:line="240" w:lineRule="auto"/>
-              <w:jc w:val="left"/>
-            </w:pPr>
-            <w:r/>
-            <w:r>
-              <w:rPr>
-                <w:rFonts w:ascii="Microsoft YaHei" w:hAnsi="Microsoft YaHei" w:eastAsia="Microsoft YaHei"/>
-                <w:b w:val="0"/>
-                <w:sz w:val="18"/>
-              </w:rPr>
+            <w:r>
               <w:t>02 02</w:t>
-            </w:r>
-            <w:r>
               <w:br/>
-            </w:r>
-            <w:r>
-              <w:rPr>
-                <w:rFonts w:ascii="Microsoft YaHei" w:hAnsi="Microsoft YaHei" w:eastAsia="Microsoft YaHei"/>
-                <w:b w:val="0"/>
-                <w:sz w:val="18"/>
-              </w:rPr>
               <w:t>停止</w:t>
             </w:r>
           </w:p>
@@ -2238,30 +2021,10 @@
             <w:shd w:fill="F2F5F7" w:val="clear"/>
           </w:tcPr>
           <w:p>
-            <w:pPr>
-              <w:keepNext w:val="0"/>
-              <w:spacing w:before="0" w:after="0" w:line="240" w:lineRule="auto"/>
-              <w:jc w:val="left"/>
-            </w:pPr>
-            <w:r/>
-            <w:r>
-              <w:rPr>
-                <w:rFonts w:ascii="Microsoft YaHei" w:hAnsi="Microsoft YaHei" w:eastAsia="Microsoft YaHei"/>
-                <w:b w:val="0"/>
-                <w:sz w:val="18"/>
-              </w:rPr>
-              <w:t>01</w:t>
-            </w:r>
-            <w:r>
+            <w:r>
+              <w:t>01/02/03</w:t>
               <w:br/>
-            </w:r>
-            <w:r>
-              <w:rPr>
-                <w:rFonts w:ascii="Microsoft YaHei" w:hAnsi="Microsoft YaHei" w:eastAsia="Microsoft YaHei"/>
-                <w:b w:val="0"/>
-                <w:sz w:val="18"/>
-              </w:rPr>
-              <w:t>X轴</w:t>
+              <w:t>X/Y/Z轴</w:t>
             </w:r>
           </w:p>
         </w:tc>
@@ -2278,18 +2041,7 @@
             <w:shd w:fill="F2F5F7" w:val="clear"/>
           </w:tcPr>
           <w:p>
-            <w:pPr>
-              <w:keepNext w:val="0"/>
-              <w:spacing w:before="0" w:after="0" w:line="240" w:lineRule="auto"/>
-              <w:jc w:val="left"/>
-            </w:pPr>
-            <w:r/>
-            <w:r>
-              <w:rPr>
-                <w:rFonts w:ascii="Microsoft YaHei" w:hAnsi="Microsoft YaHei" w:eastAsia="Microsoft YaHei"/>
-                <w:b w:val="0"/>
-                <w:sz w:val="18"/>
-              </w:rPr>
+            <w:r>
               <w:t>00</w:t>
             </w:r>
           </w:p>
@@ -2307,18 +2059,7 @@
             <w:shd w:fill="F2F5F7" w:val="clear"/>
           </w:tcPr>
           <w:p>
-            <w:pPr>
-              <w:keepNext w:val="0"/>
-              <w:spacing w:before="0" w:after="0" w:line="240" w:lineRule="auto"/>
-              <w:jc w:val="left"/>
-            </w:pPr>
-            <w:r/>
-            <w:r>
-              <w:rPr>
-                <w:rFonts w:ascii="Microsoft YaHei" w:hAnsi="Microsoft YaHei" w:eastAsia="Microsoft YaHei"/>
-                <w:b w:val="0"/>
-                <w:sz w:val="18"/>
-              </w:rPr>
+            <w:r>
               <w:t>00 00</w:t>
             </w:r>
           </w:p>
@@ -2336,18 +2077,7 @@
             <w:shd w:fill="F2F5F7" w:val="clear"/>
           </w:tcPr>
           <w:p>
-            <w:pPr>
-              <w:keepNext w:val="0"/>
-              <w:spacing w:before="0" w:after="0" w:line="240" w:lineRule="auto"/>
-              <w:jc w:val="left"/>
-            </w:pPr>
-            <w:r/>
-            <w:r>
-              <w:rPr>
-                <w:rFonts w:ascii="Microsoft YaHei" w:hAnsi="Microsoft YaHei" w:eastAsia="Microsoft YaHei"/>
-                <w:b w:val="0"/>
-                <w:sz w:val="18"/>
-              </w:rPr>
+            <w:r>
               <w:t>00 00 00 00</w:t>
             </w:r>
           </w:p>
@@ -2365,19 +2095,8 @@
             <w:shd w:fill="F2F5F7" w:val="clear"/>
           </w:tcPr>
           <w:p>
-            <w:pPr>
-              <w:keepNext w:val="0"/>
-              <w:spacing w:before="0" w:after="0" w:line="240" w:lineRule="auto"/>
-              <w:jc w:val="left"/>
-            </w:pPr>
-            <w:r/>
-            <w:r>
-              <w:rPr>
-                <w:rFonts w:ascii="Microsoft YaHei" w:hAnsi="Microsoft YaHei" w:eastAsia="Microsoft YaHei"/>
-                <w:b w:val="0"/>
-                <w:sz w:val="18"/>
-              </w:rPr>
-              <w:t>立即停PWM并拉低STEP；当前设计保持XEN有效。</w:t>
+            <w:r>
+              <w:t>立即停对应轴PWM并拉低STEP；保持对应轴EN有效。</w:t>
             </w:r>
           </w:p>
         </w:tc>
@@ -2395,29 +2114,9 @@
             </w:tcMar>
           </w:tcPr>
           <w:p>
-            <w:pPr>
-              <w:keepNext w:val="0"/>
-              <w:spacing w:before="0" w:after="0" w:line="240" w:lineRule="auto"/>
-              <w:jc w:val="left"/>
-            </w:pPr>
-            <w:r/>
-            <w:r>
-              <w:rPr>
-                <w:rFonts w:ascii="Microsoft YaHei" w:hAnsi="Microsoft YaHei" w:eastAsia="Microsoft YaHei"/>
-                <w:b w:val="0"/>
-                <w:sz w:val="18"/>
-              </w:rPr>
+            <w:r>
               <w:t>02 03</w:t>
-            </w:r>
-            <w:r>
               <w:br/>
-            </w:r>
-            <w:r>
-              <w:rPr>
-                <w:rFonts w:ascii="Microsoft YaHei" w:hAnsi="Microsoft YaHei" w:eastAsia="Microsoft YaHei"/>
-                <w:b w:val="0"/>
-                <w:sz w:val="18"/>
-              </w:rPr>
               <w:t>状态查询</w:t>
             </w:r>
           </w:p>
@@ -2434,18 +2133,7 @@
             </w:tcMar>
           </w:tcPr>
           <w:p>
-            <w:pPr>
-              <w:keepNext w:val="0"/>
-              <w:spacing w:before="0" w:after="0" w:line="240" w:lineRule="auto"/>
-              <w:jc w:val="left"/>
-            </w:pPr>
-            <w:r/>
-            <w:r>
-              <w:rPr>
-                <w:rFonts w:ascii="Microsoft YaHei" w:hAnsi="Microsoft YaHei" w:eastAsia="Microsoft YaHei"/>
-                <w:b w:val="0"/>
-                <w:sz w:val="18"/>
-              </w:rPr>
+            <w:r>
               <w:t>00</w:t>
             </w:r>
           </w:p>
@@ -2462,18 +2150,7 @@
             </w:tcMar>
           </w:tcPr>
           <w:p>
-            <w:pPr>
-              <w:keepNext w:val="0"/>
-              <w:spacing w:before="0" w:after="0" w:line="240" w:lineRule="auto"/>
-              <w:jc w:val="left"/>
-            </w:pPr>
-            <w:r/>
-            <w:r>
-              <w:rPr>
-                <w:rFonts w:ascii="Microsoft YaHei" w:hAnsi="Microsoft YaHei" w:eastAsia="Microsoft YaHei"/>
-                <w:b w:val="0"/>
-                <w:sz w:val="18"/>
-              </w:rPr>
+            <w:r>
               <w:t>00</w:t>
             </w:r>
           </w:p>
@@ -2490,18 +2167,7 @@
             </w:tcMar>
           </w:tcPr>
           <w:p>
-            <w:pPr>
-              <w:keepNext w:val="0"/>
-              <w:spacing w:before="0" w:after="0" w:line="240" w:lineRule="auto"/>
-              <w:jc w:val="left"/>
-            </w:pPr>
-            <w:r/>
-            <w:r>
-              <w:rPr>
-                <w:rFonts w:ascii="Microsoft YaHei" w:hAnsi="Microsoft YaHei" w:eastAsia="Microsoft YaHei"/>
-                <w:b w:val="0"/>
-                <w:sz w:val="18"/>
-              </w:rPr>
+            <w:r>
               <w:t>00 00</w:t>
             </w:r>
           </w:p>
@@ -2518,18 +2184,7 @@
             </w:tcMar>
           </w:tcPr>
           <w:p>
-            <w:pPr>
-              <w:keepNext w:val="0"/>
-              <w:spacing w:before="0" w:after="0" w:line="240" w:lineRule="auto"/>
-              <w:jc w:val="left"/>
-            </w:pPr>
-            <w:r/>
-            <w:r>
-              <w:rPr>
-                <w:rFonts w:ascii="Microsoft YaHei" w:hAnsi="Microsoft YaHei" w:eastAsia="Microsoft YaHei"/>
-                <w:b w:val="0"/>
-                <w:sz w:val="18"/>
-              </w:rPr>
+            <w:r>
               <w:t>00 00 00 00</w:t>
             </w:r>
           </w:p>
@@ -2546,19 +2201,8 @@
             </w:tcMar>
           </w:tcPr>
           <w:p>
-            <w:pPr>
-              <w:keepNext w:val="0"/>
-              <w:spacing w:before="0" w:after="0" w:line="240" w:lineRule="auto"/>
-              <w:jc w:val="left"/>
-            </w:pPr>
-            <w:r/>
-            <w:r>
-              <w:rPr>
-                <w:rFonts w:ascii="Microsoft YaHei" w:hAnsi="Microsoft YaHei" w:eastAsia="Microsoft YaHei"/>
-                <w:b w:val="0"/>
-                <w:sz w:val="18"/>
-              </w:rPr>
-              <w:t>返回轴号、运动状态、目标速度和已发脉冲数。</w:t>
+            <w:r>
+              <w:t>返回当前活动轴或最近目标轴的状态、目标速度和已发脉冲数。</w:t>
             </w:r>
           </w:p>
         </w:tc>
@@ -3166,7 +2810,7 @@
           <w:color w:val="1F4E79"/>
           <w:sz w:val="26"/>
         </w:rPr>
-        <w:t>4 X轴运动命令</w:t>
+        <w:t>4 X/Y/Z轴运动命令</w:t>
       </w:r>
     </w:p>
     <w:p>
@@ -3196,7 +2840,7 @@
           <w:b w:val="0"/>
           <w:sz w:val="21"/>
         </w:rPr>
-        <w:t>请求格式：55 55 02 00 01 DIR SPEED_H SPEED_L DIST3 DIST2 DIST1 DIST0 AA AA。速度和距离为大端无符号整数。</w:t>
+        <w:t>请求格式：55 55 02 00 AXIS DIR SPEED_H SPEED_L DIST3 DIST2 DIST1 DIST0 AA AA。AXIS=01/02/03分别选择X/Y/Z轴；速度和距离为大端无符号整数。</w:t>
       </w:r>
     </w:p>
     <w:tbl>
@@ -3341,19 +2985,8 @@
             </w:tcMar>
           </w:tcPr>
           <w:p>
-            <w:pPr>
-              <w:keepNext w:val="0"/>
-              <w:spacing w:before="0" w:after="0" w:line="240" w:lineRule="auto"/>
-              <w:jc w:val="left"/>
-            </w:pPr>
-            <w:r/>
-            <w:r>
-              <w:rPr>
-                <w:rFonts w:ascii="Microsoft YaHei" w:hAnsi="Microsoft YaHei" w:eastAsia="Microsoft YaHei"/>
-                <w:b w:val="0"/>
-                <w:sz w:val="18"/>
-              </w:rPr>
-              <w:t>1000 STEP/s，1000 STEP，方向0</w:t>
+            <w:r>
+              <w:t>X轴：1000 STEP/s，1000 STEP，方向0</w:t>
             </w:r>
           </w:p>
         </w:tc>
@@ -3369,18 +3002,7 @@
             </w:tcMar>
           </w:tcPr>
           <w:p>
-            <w:pPr>
-              <w:keepNext w:val="0"/>
-              <w:spacing w:before="0" w:after="0" w:line="240" w:lineRule="auto"/>
-              <w:jc w:val="left"/>
-            </w:pPr>
-            <w:r/>
-            <w:r>
-              <w:rPr>
-                <w:rFonts w:ascii="Microsoft YaHei" w:hAnsi="Microsoft YaHei" w:eastAsia="Microsoft YaHei"/>
-                <w:b w:val="0"/>
-                <w:sz w:val="18"/>
-              </w:rPr>
+            <w:r>
               <w:t>55 55 02 00 01 00 03 E8 00 00 03 E8 AA AA</w:t>
             </w:r>
           </w:p>
@@ -3397,19 +3019,8 @@
             </w:tcMar>
           </w:tcPr>
           <w:p>
-            <w:pPr>
-              <w:keepNext w:val="0"/>
-              <w:spacing w:before="0" w:after="0" w:line="240" w:lineRule="auto"/>
-              <w:jc w:val="left"/>
-            </w:pPr>
-            <w:r/>
-            <w:r>
-              <w:rPr>
-                <w:rFonts w:ascii="Microsoft YaHei" w:hAnsi="Microsoft YaHei" w:eastAsia="Microsoft YaHei"/>
-                <w:b w:val="0"/>
-                <w:sz w:val="18"/>
-              </w:rPr>
-              <w:t>常用定长测试。</w:t>
+            <w:r>
+              <w:t>X轴定长测试。</w:t>
             </w:r>
           </w:p>
         </w:tc>
@@ -3428,19 +3039,8 @@
             <w:shd w:fill="F2F5F7" w:val="clear"/>
           </w:tcPr>
           <w:p>
-            <w:pPr>
-              <w:keepNext w:val="0"/>
-              <w:spacing w:before="0" w:after="0" w:line="240" w:lineRule="auto"/>
-              <w:jc w:val="left"/>
-            </w:pPr>
-            <w:r/>
-            <w:r>
-              <w:rPr>
-                <w:rFonts w:ascii="Microsoft YaHei" w:hAnsi="Microsoft YaHei" w:eastAsia="Microsoft YaHei"/>
-                <w:b w:val="0"/>
-                <w:sz w:val="18"/>
-              </w:rPr>
-              <w:t>1000 STEP/s，1000 STEP，方向1</w:t>
+            <w:r>
+              <w:t>Y轴：1000 STEP/s，1000 STEP，方向0</w:t>
             </w:r>
           </w:p>
         </w:tc>
@@ -3457,19 +3057,8 @@
             <w:shd w:fill="F2F5F7" w:val="clear"/>
           </w:tcPr>
           <w:p>
-            <w:pPr>
-              <w:keepNext w:val="0"/>
-              <w:spacing w:before="0" w:after="0" w:line="240" w:lineRule="auto"/>
-              <w:jc w:val="left"/>
-            </w:pPr>
-            <w:r/>
-            <w:r>
-              <w:rPr>
-                <w:rFonts w:ascii="Microsoft YaHei" w:hAnsi="Microsoft YaHei" w:eastAsia="Microsoft YaHei"/>
-                <w:b w:val="0"/>
-                <w:sz w:val="18"/>
-              </w:rPr>
-              <w:t>55 55 02 00 01 01 03 E8 00 00 03 E8 AA AA</w:t>
+            <w:r>
+              <w:t>55 55 02 00 02 00 03 E8 00 00 03 E8 AA AA</w:t>
             </w:r>
           </w:p>
         </w:tc>
@@ -3486,19 +3075,8 @@
             <w:shd w:fill="F2F5F7" w:val="clear"/>
           </w:tcPr>
           <w:p>
-            <w:pPr>
-              <w:keepNext w:val="0"/>
-              <w:spacing w:before="0" w:after="0" w:line="240" w:lineRule="auto"/>
-              <w:jc w:val="left"/>
-            </w:pPr>
-            <w:r/>
-            <w:r>
-              <w:rPr>
-                <w:rFonts w:ascii="Microsoft YaHei" w:hAnsi="Microsoft YaHei" w:eastAsia="Microsoft YaHei"/>
-                <w:b w:val="0"/>
-                <w:sz w:val="18"/>
-              </w:rPr>
-              <w:t>仅DIR电平改变。</w:t>
+            <w:r>
+              <w:t>Y轴定长测试。</w:t>
             </w:r>
           </w:p>
         </w:tc>
@@ -3516,19 +3094,8 @@
             </w:tcMar>
           </w:tcPr>
           <w:p>
-            <w:pPr>
-              <w:keepNext w:val="0"/>
-              <w:spacing w:before="0" w:after="0" w:line="240" w:lineRule="auto"/>
-              <w:jc w:val="left"/>
-            </w:pPr>
-            <w:r/>
-            <w:r>
-              <w:rPr>
-                <w:rFonts w:ascii="Microsoft YaHei" w:hAnsi="Microsoft YaHei" w:eastAsia="Microsoft YaHei"/>
-                <w:b w:val="0"/>
-                <w:sz w:val="18"/>
-              </w:rPr>
-              <w:t>3000 STEP/s，3000 STEP</w:t>
+            <w:r>
+              <w:t>Z轴：1000 STEP/s，1000 STEP，方向0</w:t>
             </w:r>
           </w:p>
         </w:tc>
@@ -3544,18 +3111,78 @@
             </w:tcMar>
           </w:tcPr>
           <w:p>
-            <w:pPr>
-              <w:keepNext w:val="0"/>
-              <w:spacing w:before="0" w:after="0" w:line="240" w:lineRule="auto"/>
-              <w:jc w:val="left"/>
-            </w:pPr>
-            <w:r/>
-            <w:r>
-              <w:rPr>
-                <w:rFonts w:ascii="Microsoft YaHei" w:hAnsi="Microsoft YaHei" w:eastAsia="Microsoft YaHei"/>
-                <w:b w:val="0"/>
-                <w:sz w:val="18"/>
-              </w:rPr>
+            <w:r>
+              <w:t>55 55 02 00 03 00 03 E8 00 00 03 E8 AA AA</w:t>
+            </w:r>
+          </w:p>
+        </w:tc>
+        <w:tc>
+          <w:tcPr>
+            <w:tcW w:type="dxa" w:w="2891"/>
+            <w:vAlign w:val="center"/>
+            <w:tcMar>
+              <w:top w:w="80" w:type="dxa"/>
+              <w:start w:w="90" w:type="dxa"/>
+              <w:bottom w:w="80" w:type="dxa"/>
+              <w:end w:w="90" w:type="dxa"/>
+            </w:tcMar>
+          </w:tcPr>
+          <w:p>
+            <w:r>
+              <w:t>Z轴定长测试；测试前先释放抱闸。</w:t>
+            </w:r>
+          </w:p>
+        </w:tc>
+      </w:tr>
+      <w:tr>
+        <w:tc>
+          <w:tcPr>
+            <w:tcW w:type="dxa" w:w="1928"/>
+          </w:tcPr>
+          <w:p>
+            <w:r>
+              <w:t>X轴：1000 STEP/s，1000 STEP，方向1</w:t>
+            </w:r>
+          </w:p>
+        </w:tc>
+        <w:tc>
+          <w:tcPr>
+            <w:tcW w:type="dxa" w:w="5669"/>
+          </w:tcPr>
+          <w:p>
+            <w:r>
+              <w:t>55 55 02 00 01 01 03 E8 00 00 03 E8 AA AA</w:t>
+            </w:r>
+          </w:p>
+        </w:tc>
+        <w:tc>
+          <w:tcPr>
+            <w:tcW w:type="dxa" w:w="2891"/>
+          </w:tcPr>
+          <w:p>
+            <w:r>
+              <w:t>仅DIR电平改变。</w:t>
+            </w:r>
+          </w:p>
+        </w:tc>
+      </w:tr>
+      <w:tr>
+        <w:tc>
+          <w:tcPr>
+            <w:tcW w:type="dxa" w:w="1928"/>
+          </w:tcPr>
+          <w:p>
+            <w:r>
+              <w:t>X轴：3000 STEP/s，3000 STEP</w:t>
+            </w:r>
+          </w:p>
+        </w:tc>
+        <w:tc>
+          <w:tcPr>
+            <w:tcW w:type="dxa" w:w="5669"/>
+          </w:tcPr>
+          <w:p>
+            <w:r>
               <w:t>55 55 02 00 01 00 0B B8 00 00 0B B8 AA AA</w:t>
             </w:r>
           </w:p>
@@ -3563,28 +3190,74 @@
         <w:tc>
           <w:tcPr>
             <w:tcW w:type="dxa" w:w="2891"/>
-            <w:vAlign w:val="center"/>
-            <w:tcMar>
-              <w:top w:w="80" w:type="dxa"/>
-              <w:start w:w="90" w:type="dxa"/>
-              <w:bottom w:w="80" w:type="dxa"/>
-              <w:end w:w="90" w:type="dxa"/>
-            </w:tcMar>
-          </w:tcPr>
-          <w:p>
-            <w:pPr>
-              <w:keepNext w:val="0"/>
-              <w:spacing w:before="0" w:after="0" w:line="240" w:lineRule="auto"/>
-              <w:jc w:val="left"/>
-            </w:pPr>
-            <w:r/>
-            <w:r>
-              <w:rPr>
-                <w:rFonts w:ascii="Microsoft YaHei" w:hAnsi="Microsoft YaHei" w:eastAsia="Microsoft YaHei"/>
-                <w:b w:val="0"/>
-                <w:sz w:val="18"/>
-              </w:rPr>
-              <w:t>观察加速、匀速和减速。</w:t>
+          </w:tcPr>
+          <w:p>
+            <w:r>
+              <w:t>观察X轴加速、匀速和减速。</w:t>
+            </w:r>
+          </w:p>
+        </w:tc>
+      </w:tr>
+      <w:tr>
+        <w:tc>
+          <w:tcPr>
+            <w:tcW w:type="dxa" w:w="1928"/>
+          </w:tcPr>
+          <w:p>
+            <w:r>
+              <w:t>Y轴：3000 STEP/s，3000 STEP</w:t>
+            </w:r>
+          </w:p>
+        </w:tc>
+        <w:tc>
+          <w:tcPr>
+            <w:tcW w:type="dxa" w:w="5669"/>
+          </w:tcPr>
+          <w:p>
+            <w:r>
+              <w:t>55 55 02 00 02 00 0B B8 00 00 0B B8 AA AA</w:t>
+            </w:r>
+          </w:p>
+        </w:tc>
+        <w:tc>
+          <w:tcPr>
+            <w:tcW w:type="dxa" w:w="2891"/>
+          </w:tcPr>
+          <w:p>
+            <w:r>
+              <w:t>观察Y轴加速、匀速和减速。</w:t>
+            </w:r>
+          </w:p>
+        </w:tc>
+      </w:tr>
+      <w:tr>
+        <w:tc>
+          <w:tcPr>
+            <w:tcW w:type="dxa" w:w="1928"/>
+          </w:tcPr>
+          <w:p>
+            <w:r>
+              <w:t>Z轴：3000 STEP/s，3000 STEP</w:t>
+            </w:r>
+          </w:p>
+        </w:tc>
+        <w:tc>
+          <w:tcPr>
+            <w:tcW w:type="dxa" w:w="5669"/>
+          </w:tcPr>
+          <w:p>
+            <w:r>
+              <w:t>55 55 02 00 03 00 0B B8 00 00 0B B8 AA AA</w:t>
+            </w:r>
+          </w:p>
+        </w:tc>
+        <w:tc>
+          <w:tcPr>
+            <w:tcW w:type="dxa" w:w="2891"/>
+          </w:tcPr>
+          <w:p>
+            <w:r>
+              <w:t>观察Z轴加速、匀速和减速；测试前先释放抱闸。</w:t>
             </w:r>
           </w:p>
         </w:tc>
@@ -3602,7 +3275,7 @@
           <w:b w:val="0"/>
           <w:sz w:val="21"/>
         </w:rPr>
-        <w:t>参数限制：速度1000～10000 STEP/s；距离1～12000 STEP；距离还必须满足距离≤速度×5。D0只能为01，D1只能为00或01。</w:t>
+        <w:t>参数限制：速度1000～10000 STEP/s；距离1～12000 STEP；距离还必须满足距离≤速度×5。D0只能为01、02或03，分别对应X/Y/Z轴；D1只能为00或01。</w:t>
       </w:r>
     </w:p>
     <w:p>
@@ -3690,7 +3363,7 @@
           <w:b w:val="0"/>
           <w:sz w:val="21"/>
         </w:rPr>
-        <w:t>请求格式：55 55 02 F0 01 DIR SPEED_H SPEED_L 00 00 00 00 AA AA。距离字段必须填0，命令不会自动按距离结束。</w:t>
+        <w:t>请求格式：55 55 02 F0 AXIS DIR SPEED_H SPEED_L 00 00 00 00 AA AA。AXIS=01/02/03分别选择X/Y/Z轴；距离字段必须填0，命令不会自动按距离结束。</w:t>
       </w:r>
     </w:p>
     <w:p>
@@ -3704,7 +3377,7 @@
           <w:b w:val="0"/>
           <w:sz w:val="21"/>
         </w:rPr>
-        <w:t>示例：55 55 02 F0 01 00 03 E8 00 00 00 00 AA AA，表示X轴方向0、1000 STEP/s连续运行。</w:t>
+        <w:t>示例：55 55 02 F0 02 00 03 E8 00 00 00 00 AA AA，表示Y轴方向0、1000 STEP/s连续运行；将AXIS改为01或03即可分别测试X轴或Z轴。</w:t>
       </w:r>
     </w:p>
     <w:p>
@@ -3734,7 +3407,7 @@
           <w:b w:val="0"/>
           <w:sz w:val="21"/>
         </w:rPr>
-        <w:t>当前设计中，运行启动后XEN为低电平有效。普通停止、定长运动完成和限位停止都会关闭STEP输出，但保持XEN有效，使电机继续保持抱持力。上电初始化以及启动前检查失败、TMC故障或定时器故障时，XEN保持禁止状态。</w:t>
+        <w:t>当前设计中，运行启动后活动轴EN为低电平有效。普通停止、定长运动完成和限位停止都会关闭活动轴STEP输出，但保持该轴EN有效，使电机继续保持抱持力。上电初始化以及启动前检查失败、TMC故障或定时器故障时，对应轴EN保持禁止状态。</w:t>
       </w:r>
     </w:p>
     <w:p>
@@ -3947,18 +3620,7 @@
             </w:tcMar>
           </w:tcPr>
           <w:p>
-            <w:pPr>
-              <w:keepNext w:val="0"/>
-              <w:spacing w:before="0" w:after="0" w:line="240" w:lineRule="auto"/>
-              <w:jc w:val="left"/>
-            </w:pPr>
-            <w:r/>
-            <w:r>
-              <w:rPr>
-                <w:rFonts w:ascii="Microsoft YaHei" w:hAnsi="Microsoft YaHei" w:eastAsia="Microsoft YaHei"/>
-                <w:b w:val="0"/>
-                <w:sz w:val="18"/>
-              </w:rPr>
+            <w:r>
               <w:t>X负限位</w:t>
             </w:r>
           </w:p>
@@ -3975,18 +3637,7 @@
             </w:tcMar>
           </w:tcPr>
           <w:p>
-            <w:pPr>
-              <w:keepNext w:val="0"/>
-              <w:spacing w:before="0" w:after="0" w:line="240" w:lineRule="auto"/>
-              <w:jc w:val="left"/>
-            </w:pPr>
-            <w:r/>
-            <w:r>
-              <w:rPr>
-                <w:rFonts w:ascii="Microsoft YaHei" w:hAnsi="Microsoft YaHei" w:eastAsia="Microsoft YaHei"/>
-                <w:b w:val="0"/>
-                <w:sz w:val="18"/>
-              </w:rPr>
+            <w:r>
               <w:t>CN7 / PC6</w:t>
             </w:r>
           </w:p>
@@ -4003,18 +3654,7 @@
             </w:tcMar>
           </w:tcPr>
           <w:p>
-            <w:pPr>
-              <w:keepNext w:val="0"/>
-              <w:spacing w:before="0" w:after="0" w:line="240" w:lineRule="auto"/>
-              <w:jc w:val="left"/>
-            </w:pPr>
-            <w:r/>
-            <w:r>
-              <w:rPr>
-                <w:rFonts w:ascii="Microsoft YaHei" w:hAnsi="Microsoft YaHei" w:eastAsia="Microsoft YaHei"/>
-                <w:b w:val="0"/>
-                <w:sz w:val="18"/>
-              </w:rPr>
+            <w:r>
               <w:t>0001</w:t>
             </w:r>
           </w:p>
@@ -4031,18 +3671,7 @@
             </w:tcMar>
           </w:tcPr>
           <w:p>
-            <w:pPr>
-              <w:keepNext w:val="0"/>
-              <w:spacing w:before="0" w:after="0" w:line="240" w:lineRule="auto"/>
-              <w:jc w:val="left"/>
-            </w:pPr>
-            <w:r/>
-            <w:r>
-              <w:rPr>
-                <w:rFonts w:ascii="Microsoft YaHei" w:hAnsi="Microsoft YaHei" w:eastAsia="Microsoft YaHei"/>
-                <w:b w:val="0"/>
-                <w:sz w:val="18"/>
-              </w:rPr>
+            <w:r>
               <w:t>立即停止X轴STEP，保持XEN</w:t>
             </w:r>
           </w:p>
@@ -4062,18 +3691,7 @@
             <w:shd w:fill="F2F5F7" w:val="clear"/>
           </w:tcPr>
           <w:p>
-            <w:pPr>
-              <w:keepNext w:val="0"/>
-              <w:spacing w:before="0" w:after="0" w:line="240" w:lineRule="auto"/>
-              <w:jc w:val="left"/>
-            </w:pPr>
-            <w:r/>
-            <w:r>
-              <w:rPr>
-                <w:rFonts w:ascii="Microsoft YaHei" w:hAnsi="Microsoft YaHei" w:eastAsia="Microsoft YaHei"/>
-                <w:b w:val="0"/>
-                <w:sz w:val="18"/>
-              </w:rPr>
+            <w:r>
               <w:t>X零点</w:t>
             </w:r>
           </w:p>
@@ -4091,18 +3709,7 @@
             <w:shd w:fill="F2F5F7" w:val="clear"/>
           </w:tcPr>
           <w:p>
-            <w:pPr>
-              <w:keepNext w:val="0"/>
-              <w:spacing w:before="0" w:after="0" w:line="240" w:lineRule="auto"/>
-              <w:jc w:val="left"/>
-            </w:pPr>
-            <w:r/>
-            <w:r>
-              <w:rPr>
-                <w:rFonts w:ascii="Microsoft YaHei" w:hAnsi="Microsoft YaHei" w:eastAsia="Microsoft YaHei"/>
-                <w:b w:val="0"/>
-                <w:sz w:val="18"/>
-              </w:rPr>
+            <w:r>
               <w:t>CN11 / PB15</w:t>
             </w:r>
           </w:p>
@@ -4120,18 +3727,7 @@
             <w:shd w:fill="F2F5F7" w:val="clear"/>
           </w:tcPr>
           <w:p>
-            <w:pPr>
-              <w:keepNext w:val="0"/>
-              <w:spacing w:before="0" w:after="0" w:line="240" w:lineRule="auto"/>
-              <w:jc w:val="left"/>
-            </w:pPr>
-            <w:r/>
-            <w:r>
-              <w:rPr>
-                <w:rFonts w:ascii="Microsoft YaHei" w:hAnsi="Microsoft YaHei" w:eastAsia="Microsoft YaHei"/>
-                <w:b w:val="0"/>
-                <w:sz w:val="18"/>
-              </w:rPr>
+            <w:r>
               <w:t>0002</w:t>
             </w:r>
           </w:p>
@@ -4149,18 +3745,7 @@
             <w:shd w:fill="F2F5F7" w:val="clear"/>
           </w:tcPr>
           <w:p>
-            <w:pPr>
-              <w:keepNext w:val="0"/>
-              <w:spacing w:before="0" w:after="0" w:line="240" w:lineRule="auto"/>
-              <w:jc w:val="left"/>
-            </w:pPr>
-            <w:r/>
-            <w:r>
-              <w:rPr>
-                <w:rFonts w:ascii="Microsoft YaHei" w:hAnsi="Microsoft YaHei" w:eastAsia="Microsoft YaHei"/>
-                <w:b w:val="0"/>
-                <w:sz w:val="18"/>
-              </w:rPr>
+            <w:r>
               <w:t>立即停止X轴STEP，保持XEN</w:t>
             </w:r>
           </w:p>
@@ -4179,18 +3764,7 @@
             </w:tcMar>
           </w:tcPr>
           <w:p>
-            <w:pPr>
-              <w:keepNext w:val="0"/>
-              <w:spacing w:before="0" w:after="0" w:line="240" w:lineRule="auto"/>
-              <w:jc w:val="left"/>
-            </w:pPr>
-            <w:r/>
-            <w:r>
-              <w:rPr>
-                <w:rFonts w:ascii="Microsoft YaHei" w:hAnsi="Microsoft YaHei" w:eastAsia="Microsoft YaHei"/>
-                <w:b w:val="0"/>
-                <w:sz w:val="18"/>
-              </w:rPr>
+            <w:r>
               <w:t>X正限位</w:t>
             </w:r>
           </w:p>
@@ -4207,18 +3781,7 @@
             </w:tcMar>
           </w:tcPr>
           <w:p>
-            <w:pPr>
-              <w:keepNext w:val="0"/>
-              <w:spacing w:before="0" w:after="0" w:line="240" w:lineRule="auto"/>
-              <w:jc w:val="left"/>
-            </w:pPr>
-            <w:r/>
-            <w:r>
-              <w:rPr>
-                <w:rFonts w:ascii="Microsoft YaHei" w:hAnsi="Microsoft YaHei" w:eastAsia="Microsoft YaHei"/>
-                <w:b w:val="0"/>
-                <w:sz w:val="18"/>
-              </w:rPr>
+            <w:r>
               <w:t>CN14 / PB14</w:t>
             </w:r>
           </w:p>
@@ -4235,18 +3798,7 @@
             </w:tcMar>
           </w:tcPr>
           <w:p>
-            <w:pPr>
-              <w:keepNext w:val="0"/>
-              <w:spacing w:before="0" w:after="0" w:line="240" w:lineRule="auto"/>
-              <w:jc w:val="left"/>
-            </w:pPr>
-            <w:r/>
-            <w:r>
-              <w:rPr>
-                <w:rFonts w:ascii="Microsoft YaHei" w:hAnsi="Microsoft YaHei" w:eastAsia="Microsoft YaHei"/>
-                <w:b w:val="0"/>
-                <w:sz w:val="18"/>
-              </w:rPr>
+            <w:r>
               <w:t>0004</w:t>
             </w:r>
           </w:p>
@@ -4263,18 +3815,7 @@
             </w:tcMar>
           </w:tcPr>
           <w:p>
-            <w:pPr>
-              <w:keepNext w:val="0"/>
-              <w:spacing w:before="0" w:after="0" w:line="240" w:lineRule="auto"/>
-              <w:jc w:val="left"/>
-            </w:pPr>
-            <w:r/>
-            <w:r>
-              <w:rPr>
-                <w:rFonts w:ascii="Microsoft YaHei" w:hAnsi="Microsoft YaHei" w:eastAsia="Microsoft YaHei"/>
-                <w:b w:val="0"/>
-                <w:sz w:val="18"/>
-              </w:rPr>
+            <w:r>
               <w:t>立即停止X轴STEP，保持XEN</w:t>
             </w:r>
           </w:p>
@@ -4294,19 +3835,8 @@
             <w:shd w:fill="F2F5F7" w:val="clear"/>
           </w:tcPr>
           <w:p>
-            <w:pPr>
-              <w:keepNext w:val="0"/>
-              <w:spacing w:before="0" w:after="0" w:line="240" w:lineRule="auto"/>
-              <w:jc w:val="left"/>
-            </w:pPr>
-            <w:r/>
-            <w:r>
-              <w:rPr>
-                <w:rFonts w:ascii="Microsoft YaHei" w:hAnsi="Microsoft YaHei" w:eastAsia="Microsoft YaHei"/>
-                <w:b w:val="0"/>
-                <w:sz w:val="18"/>
-              </w:rPr>
-              <w:t>Y三路</w:t>
+            <w:r>
+              <w:t>Y负限位</w:t>
             </w:r>
           </w:p>
         </w:tc>
@@ -4323,19 +3853,8 @@
             <w:shd w:fill="F2F5F7" w:val="clear"/>
           </w:tcPr>
           <w:p>
-            <w:pPr>
-              <w:keepNext w:val="0"/>
-              <w:spacing w:before="0" w:after="0" w:line="240" w:lineRule="auto"/>
-              <w:jc w:val="left"/>
-            </w:pPr>
-            <w:r/>
-            <w:r>
-              <w:rPr>
-                <w:rFonts w:ascii="Microsoft YaHei" w:hAnsi="Microsoft YaHei" w:eastAsia="Microsoft YaHei"/>
-                <w:b w:val="0"/>
-                <w:sz w:val="18"/>
-              </w:rPr>
-              <w:t>PC9 / PC8 / PC7</w:t>
+            <w:r>
+              <w:t>CN8 / PC9</w:t>
             </w:r>
           </w:p>
         </w:tc>
@@ -4352,19 +3871,8 @@
             <w:shd w:fill="F2F5F7" w:val="clear"/>
           </w:tcPr>
           <w:p>
-            <w:pPr>
-              <w:keepNext w:val="0"/>
-              <w:spacing w:before="0" w:after="0" w:line="240" w:lineRule="auto"/>
-              <w:jc w:val="left"/>
-            </w:pPr>
-            <w:r/>
-            <w:r>
-              <w:rPr>
-                <w:rFonts w:ascii="Microsoft YaHei" w:hAnsi="Microsoft YaHei" w:eastAsia="Microsoft YaHei"/>
-                <w:b w:val="0"/>
-                <w:sz w:val="18"/>
-              </w:rPr>
-              <w:t>0008/0010/0020</w:t>
+            <w:r>
+              <w:t>0008</w:t>
             </w:r>
           </w:p>
         </w:tc>
@@ -4381,19 +3889,8 @@
             <w:shd w:fill="F2F5F7" w:val="clear"/>
           </w:tcPr>
           <w:p>
-            <w:pPr>
-              <w:keepNext w:val="0"/>
-              <w:spacing w:before="0" w:after="0" w:line="240" w:lineRule="auto"/>
-              <w:jc w:val="left"/>
-            </w:pPr>
-            <w:r/>
-            <w:r>
-              <w:rPr>
-                <w:rFonts w:ascii="Microsoft YaHei" w:hAnsi="Microsoft YaHei" w:eastAsia="Microsoft YaHei"/>
-                <w:b w:val="0"/>
-                <w:sz w:val="18"/>
-              </w:rPr>
-              <w:t>仅记录状态，不停止X轴</w:t>
+            <w:r>
+              <w:t>立即停止Y轴STEP，保持YEN</w:t>
             </w:r>
           </w:p>
         </w:tc>
@@ -4411,19 +3908,8 @@
             </w:tcMar>
           </w:tcPr>
           <w:p>
-            <w:pPr>
-              <w:keepNext w:val="0"/>
-              <w:spacing w:before="0" w:after="0" w:line="240" w:lineRule="auto"/>
-              <w:jc w:val="left"/>
-            </w:pPr>
-            <w:r/>
-            <w:r>
-              <w:rPr>
-                <w:rFonts w:ascii="Microsoft YaHei" w:hAnsi="Microsoft YaHei" w:eastAsia="Microsoft YaHei"/>
-                <w:b w:val="0"/>
-                <w:sz w:val="18"/>
-              </w:rPr>
-              <w:t>Z三路</w:t>
+            <w:r>
+              <w:t>Y零点</w:t>
             </w:r>
           </w:p>
         </w:tc>
@@ -4439,19 +3925,8 @@
             </w:tcMar>
           </w:tcPr>
           <w:p>
-            <w:pPr>
-              <w:keepNext w:val="0"/>
-              <w:spacing w:before="0" w:after="0" w:line="240" w:lineRule="auto"/>
-              <w:jc w:val="left"/>
-            </w:pPr>
-            <w:r/>
-            <w:r>
-              <w:rPr>
-                <w:rFonts w:ascii="Microsoft YaHei" w:hAnsi="Microsoft YaHei" w:eastAsia="Microsoft YaHei"/>
-                <w:b w:val="0"/>
-                <w:sz w:val="18"/>
-              </w:rPr>
-              <w:t>PA12 / PA11 / PA10</w:t>
+            <w:r>
+              <w:t>CN12 / PC8</w:t>
             </w:r>
           </w:p>
         </w:tc>
@@ -4467,19 +3942,8 @@
             </w:tcMar>
           </w:tcPr>
           <w:p>
-            <w:pPr>
-              <w:keepNext w:val="0"/>
-              <w:spacing w:before="0" w:after="0" w:line="240" w:lineRule="auto"/>
-              <w:jc w:val="left"/>
-            </w:pPr>
-            <w:r/>
-            <w:r>
-              <w:rPr>
-                <w:rFonts w:ascii="Microsoft YaHei" w:hAnsi="Microsoft YaHei" w:eastAsia="Microsoft YaHei"/>
-                <w:b w:val="0"/>
-                <w:sz w:val="18"/>
-              </w:rPr>
-              <w:t>0040/0080/0100</w:t>
+            <w:r>
+              <w:t>0010</w:t>
             </w:r>
           </w:p>
         </w:tc>
@@ -4495,19 +3959,176 @@
             </w:tcMar>
           </w:tcPr>
           <w:p>
-            <w:pPr>
-              <w:keepNext w:val="0"/>
-              <w:spacing w:before="0" w:after="0" w:line="240" w:lineRule="auto"/>
-              <w:jc w:val="left"/>
-            </w:pPr>
-            <w:r/>
-            <w:r>
-              <w:rPr>
-                <w:rFonts w:ascii="Microsoft YaHei" w:hAnsi="Microsoft YaHei" w:eastAsia="Microsoft YaHei"/>
-                <w:b w:val="0"/>
-                <w:sz w:val="18"/>
-              </w:rPr>
-              <w:t>仅记录状态，不停止X轴</w:t>
+            <w:r>
+              <w:t>立即停止Y轴STEP，保持YEN</w:t>
+            </w:r>
+          </w:p>
+        </w:tc>
+      </w:tr>
+      <w:tr>
+        <w:tc>
+          <w:tcPr>
+            <w:tcW w:type="dxa" w:w="1701"/>
+          </w:tcPr>
+          <w:p>
+            <w:r>
+              <w:t>Y正限位</w:t>
+            </w:r>
+          </w:p>
+        </w:tc>
+        <w:tc>
+          <w:tcPr>
+            <w:tcW w:type="dxa" w:w="2835"/>
+          </w:tcPr>
+          <w:p>
+            <w:r>
+              <w:t>CN15 / PC7</w:t>
+            </w:r>
+          </w:p>
+        </w:tc>
+        <w:tc>
+          <w:tcPr>
+            <w:tcW w:type="dxa" w:w="1701"/>
+          </w:tcPr>
+          <w:p>
+            <w:r>
+              <w:t>0020</w:t>
+            </w:r>
+          </w:p>
+        </w:tc>
+        <w:tc>
+          <w:tcPr>
+            <w:tcW w:type="dxa" w:w="4252"/>
+          </w:tcPr>
+          <w:p>
+            <w:r>
+              <w:t>立即停止Y轴STEP，保持YEN</w:t>
+            </w:r>
+          </w:p>
+        </w:tc>
+      </w:tr>
+      <w:tr>
+        <w:tc>
+          <w:tcPr>
+            <w:tcW w:type="dxa" w:w="1701"/>
+          </w:tcPr>
+          <w:p>
+            <w:r>
+              <w:t>Z负限位</w:t>
+            </w:r>
+          </w:p>
+        </w:tc>
+        <w:tc>
+          <w:tcPr>
+            <w:tcW w:type="dxa" w:w="2835"/>
+          </w:tcPr>
+          <w:p>
+            <w:r>
+              <w:t>CN9 / PA12</w:t>
+            </w:r>
+          </w:p>
+        </w:tc>
+        <w:tc>
+          <w:tcPr>
+            <w:tcW w:type="dxa" w:w="1701"/>
+          </w:tcPr>
+          <w:p>
+            <w:r>
+              <w:t>0040</w:t>
+            </w:r>
+          </w:p>
+        </w:tc>
+        <w:tc>
+          <w:tcPr>
+            <w:tcW w:type="dxa" w:w="4252"/>
+          </w:tcPr>
+          <w:p>
+            <w:r>
+              <w:t>立即停止Z轴STEP，保持ZEN</w:t>
+            </w:r>
+          </w:p>
+        </w:tc>
+      </w:tr>
+      <w:tr>
+        <w:tc>
+          <w:tcPr>
+            <w:tcW w:type="dxa" w:w="1701"/>
+          </w:tcPr>
+          <w:p>
+            <w:r>
+              <w:t>Z零点</w:t>
+            </w:r>
+          </w:p>
+        </w:tc>
+        <w:tc>
+          <w:tcPr>
+            <w:tcW w:type="dxa" w:w="2835"/>
+          </w:tcPr>
+          <w:p>
+            <w:r>
+              <w:t>CN13 / PA11</w:t>
+            </w:r>
+          </w:p>
+        </w:tc>
+        <w:tc>
+          <w:tcPr>
+            <w:tcW w:type="dxa" w:w="1701"/>
+          </w:tcPr>
+          <w:p>
+            <w:r>
+              <w:t>0080</w:t>
+            </w:r>
+          </w:p>
+        </w:tc>
+        <w:tc>
+          <w:tcPr>
+            <w:tcW w:type="dxa" w:w="4252"/>
+          </w:tcPr>
+          <w:p>
+            <w:r>
+              <w:t>立即停止Z轴STEP，保持ZEN</w:t>
+            </w:r>
+          </w:p>
+        </w:tc>
+      </w:tr>
+      <w:tr>
+        <w:tc>
+          <w:tcPr>
+            <w:tcW w:type="dxa" w:w="1701"/>
+          </w:tcPr>
+          <w:p>
+            <w:r>
+              <w:t>Z正限位</w:t>
+            </w:r>
+          </w:p>
+        </w:tc>
+        <w:tc>
+          <w:tcPr>
+            <w:tcW w:type="dxa" w:w="2835"/>
+          </w:tcPr>
+          <w:p>
+            <w:r>
+              <w:t>CN16 / PA10</w:t>
+            </w:r>
+          </w:p>
+        </w:tc>
+        <w:tc>
+          <w:tcPr>
+            <w:tcW w:type="dxa" w:w="1701"/>
+          </w:tcPr>
+          <w:p>
+            <w:r>
+              <w:t>0100</w:t>
+            </w:r>
+          </w:p>
+        </w:tc>
+        <w:tc>
+          <w:tcPr>
+            <w:tcW w:type="dxa" w:w="4252"/>
+          </w:tcPr>
+          <w:p>
+            <w:r>
+              <w:t>立即停止Z轴STEP，保持ZEN</w:t>
             </w:r>
           </w:p>
         </w:tc>
@@ -4525,7 +4146,7 @@
           <w:b w:val="0"/>
           <w:sz w:val="21"/>
         </w:rPr>
-        <w:t>X轴运动中，PC6、PB15、PB14任一路出现遮光上升沿时，EXTI中断立即关闭X轴STEP；主循环随后回传限位错误。移除遮光不会自动重启，必须发送新的合法运动命令。</w:t>
+        <w:t>X/Y/Z任一轴运动中，该轴对应的三路限位出现遮光上升沿时，EXTI中断立即关闭该轴STEP；主循环随后回传限位错误。移除遮光不会自动重启，必须发送新的合法运动命令。其他轴的限位不会误停当前运动轴。</w:t>
       </w:r>
     </w:p>
     <w:p>
@@ -5363,19 +4984,8 @@
             <w:shd w:fill="F2F5F7" w:val="clear"/>
           </w:tcPr>
           <w:p>
-            <w:pPr>
-              <w:keepNext w:val="0"/>
-              <w:spacing w:before="0" w:after="0" w:line="240" w:lineRule="auto"/>
-              <w:jc w:val="left"/>
-            </w:pPr>
-            <w:r/>
-            <w:r>
-              <w:rPr>
-                <w:rFonts w:ascii="Microsoft YaHei" w:hAnsi="Microsoft YaHei" w:eastAsia="Microsoft YaHei"/>
-                <w:b w:val="0"/>
-                <w:sz w:val="18"/>
-              </w:rPr>
-              <w:t>轴号错误（当前仅X）</w:t>
+            <w:r>
+              <w:t>轴号错误（非01/02/03）</w:t>
             </w:r>
           </w:p>
         </w:tc>
@@ -6665,7 +6275,7 @@
           <w:b w:val="0"/>
           <w:sz w:val="21"/>
         </w:rPr>
-        <w:t>上电后不发送运动命令，确认X轴限位均为正常通光状态。</w:t>
+        <w:t>上电后不发送运动命令，确认X/Y/Z轴限位均为正常通光状态。</w:t>
       </w:r>
     </w:p>
     <w:p>
@@ -6701,7 +6311,7 @@
           <w:b w:val="0"/>
           <w:sz w:val="21"/>
         </w:rPr>
-        <w:t>发送02 00定长运动，核对已接受、STEP脉冲数和完成应答。</w:t>
+        <w:t>分别将AXIS设为01、02、03发送02 00定长运动，核对已接受、对应轴STEP脉冲数和完成应答。</w:t>
       </w:r>
     </w:p>
     <w:p>
@@ -6719,7 +6329,7 @@
           <w:b w:val="0"/>
           <w:sz w:val="21"/>
         </w:rPr>
-        <w:t>发送02 F0连续运动，确认持续输出STEP。</w:t>
+        <w:t>分别将AXIS设为01、02、03发送02 F0连续运动，确认只有指定轴持续输出STEP；随后发送同轴02 02停止。</w:t>
       </w:r>
     </w:p>
     <w:p>
@@ -6737,7 +6347,7 @@
           <w:b w:val="0"/>
           <w:sz w:val="21"/>
         </w:rPr>
-        <w:t>运动中遮挡PC6、PB15、PB14，逐一路验证STEP立即停止、XEN保持有效，并回传错误码0B。</w:t>
+        <w:t>分别运行X/Y/Z轴并逐一路遮挡本轴限位：X为PC6/PB15/PB14，Y为PC9/PC8/PC7，Z为PA12/PA11/PA10；验证对应STEP立即停止、对应EN保持有效，并回传错误码0B。</w:t>
       </w:r>
     </w:p>
     <w:p>
@@ -6773,7 +6383,7 @@
           <w:b w:val="0"/>
           <w:sz w:val="21"/>
         </w:rPr>
-        <w:t>最后测试02 02普通停止，并确认停止后电机仍保持抱持力。</w:t>
+        <w:t>最后分别对X/Y/Z轴测试02 02普通停止，并确认停止后对应电机仍保持抱持力。</w:t>
       </w:r>
     </w:p>
     <w:sectPr>

</xml_diff>